<commit_message>
Correccion de documento 2.4
</commit_message>
<xml_diff>
--- a/Fase 2/Evidencias Grupales/2.4_GuiaEstudiante_Fase2_DesarrolloProyecto_APT_Completada.docx
+++ b/Fase 2/Evidencias Grupales/2.4_GuiaEstudiante_Fase2_DesarrolloProyecto_APT_Completada.docx
@@ -1,6 +1,6 @@
 
 <file path=word/document.xml><?xml version="1.0" encoding="utf-8"?>
-<w:document xmlns:wpc="http://schemas.microsoft.com/office/word/2010/wordprocessingCanvas" xmlns:cx="http://schemas.microsoft.com/office/drawing/2014/chartex" xmlns:cx1="http://schemas.microsoft.com/office/drawing/2015/9/8/chartex" xmlns:cx2="http://schemas.microsoft.com/office/drawing/2015/10/21/chartex" xmlns:cx3="http://schemas.microsoft.com/office/drawing/2016/5/9/chartex" xmlns:cx4="http://schemas.microsoft.com/office/drawing/2016/5/10/chartex" xmlns:cx5="http://schemas.microsoft.com/office/drawing/2016/5/11/chartex" xmlns:cx6="http://schemas.microsoft.com/office/drawing/2016/5/12/chartex" xmlns:cx7="http://schemas.microsoft.com/office/drawing/2016/5/13/chartex" xmlns:cx8="http://schemas.microsoft.com/office/drawing/2016/5/14/chartex" xmlns:mc="http://schemas.openxmlformats.org/markup-compatibility/2006" xmlns:aink="http://schemas.microsoft.com/office/drawing/2016/ink" xmlns:am3d="http://schemas.microsoft.com/office/drawing/2017/model3d" xmlns:o="urn:schemas-microsoft-com:office:office" xmlns:oel="http://schemas.microsoft.com/office/2019/extlst" xmlns:r="http://schemas.openxmlformats.org/officeDocument/2006/relationships" xmlns:m="http://schemas.openxmlformats.org/officeDocument/2006/math" xmlns:v="urn:schemas-microsoft-com:vml" xmlns:wp14="http://schemas.microsoft.com/office/word/2010/wordprocessingDrawing" xmlns:wp="http://schemas.openxmlformats.org/drawingml/2006/wordprocessingDrawing" xmlns:w10="urn:schemas-microsoft-com:office:word" xmlns:w="http://schemas.openxmlformats.org/wordprocessingml/2006/main" xmlns:w14="http://schemas.microsoft.com/office/word/2010/wordml" xmlns:w15="http://schemas.microsoft.com/office/word/2012/wordml" xmlns:w16cex="http://schemas.microsoft.com/office/word/2018/wordml/cex" xmlns:w16cid="http://schemas.microsoft.com/office/word/2016/wordml/cid" xmlns:w16="http://schemas.microsoft.com/office/word/2018/wordml" xmlns:w16sdtdh="http://schemas.microsoft.com/office/word/2020/wordml/sdtdatahash" xmlns:w16se="http://schemas.microsoft.com/office/word/2015/wordml/symex" xmlns:wpg="http://schemas.microsoft.com/office/word/2010/wordprocessingGroup" xmlns:wpi="http://schemas.microsoft.com/office/word/2010/wordprocessingInk" xmlns:wne="http://schemas.microsoft.com/office/word/2006/wordml" xmlns:wps="http://schemas.microsoft.com/office/word/2010/wordprocessingShape" mc:Ignorable="w14 w15 w16se w16cid w16 w16cex w16sdtdh wp14">
+<w:document xmlns:wpc="http://schemas.microsoft.com/office/word/2010/wordprocessingCanvas" xmlns:cx="http://schemas.microsoft.com/office/drawing/2014/chartex" xmlns:cx1="http://schemas.microsoft.com/office/drawing/2015/9/8/chartex" xmlns:cx2="http://schemas.microsoft.com/office/drawing/2015/10/21/chartex" xmlns:cx3="http://schemas.microsoft.com/office/drawing/2016/5/9/chartex" xmlns:cx4="http://schemas.microsoft.com/office/drawing/2016/5/10/chartex" xmlns:cx5="http://schemas.microsoft.com/office/drawing/2016/5/11/chartex" xmlns:cx6="http://schemas.microsoft.com/office/drawing/2016/5/12/chartex" xmlns:cx7="http://schemas.microsoft.com/office/drawing/2016/5/13/chartex" xmlns:cx8="http://schemas.microsoft.com/office/drawing/2016/5/14/chartex" xmlns:mc="http://schemas.openxmlformats.org/markup-compatibility/2006" xmlns:aink="http://schemas.microsoft.com/office/drawing/2016/ink" xmlns:am3d="http://schemas.microsoft.com/office/drawing/2017/model3d" xmlns:o="urn:schemas-microsoft-com:office:office" xmlns:oel="http://schemas.microsoft.com/office/2019/extlst" xmlns:r="http://schemas.openxmlformats.org/officeDocument/2006/relationships" xmlns:m="http://schemas.openxmlformats.org/officeDocument/2006/math" xmlns:v="urn:schemas-microsoft-com:vml" xmlns:wp14="http://schemas.microsoft.com/office/word/2010/wordprocessingDrawing" xmlns:wp="http://schemas.openxmlformats.org/drawingml/2006/wordprocessingDrawing" xmlns:w10="urn:schemas-microsoft-com:office:word" xmlns:w="http://schemas.openxmlformats.org/wordprocessingml/2006/main" xmlns:w14="http://schemas.microsoft.com/office/word/2010/wordml" xmlns:w15="http://schemas.microsoft.com/office/word/2012/wordml" xmlns:w16cex="http://schemas.microsoft.com/office/word/2018/wordml/cex" xmlns:w16cid="http://schemas.microsoft.com/office/word/2016/wordml/cid" xmlns:w16="http://schemas.microsoft.com/office/word/2018/wordml" xmlns:w16du="http://schemas.microsoft.com/office/word/2023/wordml/word16du" xmlns:w16sdtdh="http://schemas.microsoft.com/office/word/2020/wordml/sdtdatahash" xmlns:w16sdtfl="http://schemas.microsoft.com/office/word/2024/wordml/sdtformatlock" xmlns:w16se="http://schemas.microsoft.com/office/word/2015/wordml/symex" xmlns:wpg="http://schemas.microsoft.com/office/word/2010/wordprocessingGroup" xmlns:wpi="http://schemas.microsoft.com/office/word/2010/wordprocessingInk" xmlns:wne="http://schemas.microsoft.com/office/word/2006/wordml" xmlns:wps="http://schemas.microsoft.com/office/word/2010/wordprocessingShape" mc:Ignorable="w14 w15 w16se w16cid w16 w16cex w16sdtdh w16sdtfl w16du wp14">
   <w:body>
     <w:p/>
     <w:p>
@@ -434,7 +434,23 @@
           <w:rFonts w:ascii="Calibri" w:hAnsi="Calibri"/>
           <w:color w:val="000000"/>
         </w:rPr>
-        <w:t>Proyecto: Plataforma web multisede de gestión académica y agendamiento dinámico para la Escuela de Conductores Futuro.</w:t>
+        <w:t xml:space="preserve">Proyecto: Plataforma web </w:t>
+      </w:r>
+      <w:proofErr w:type="spellStart"/>
+      <w:r>
+        <w:rPr>
+          <w:rFonts w:ascii="Calibri" w:hAnsi="Calibri"/>
+          <w:color w:val="000000"/>
+        </w:rPr>
+        <w:t>multisede</w:t>
+      </w:r>
+      <w:proofErr w:type="spellEnd"/>
+      <w:r>
+        <w:rPr>
+          <w:rFonts w:ascii="Calibri" w:hAnsi="Calibri"/>
+          <w:color w:val="000000"/>
+        </w:rPr>
+        <w:t xml:space="preserve"> de gestión académica y agendamiento dinámico para la Escuela de Conductores Futuro.</w:t>
       </w:r>
     </w:p>
     <w:p>
@@ -458,7 +474,23 @@
           <w:rFonts w:ascii="Calibri" w:hAnsi="Calibri"/>
           <w:color w:val="000000"/>
         </w:rPr>
-        <w:t>Asignatura: Capstone PTY4614 | Sección: 001D | Docente: Diego Alberto Garcés Miranda.</w:t>
+        <w:t xml:space="preserve">Asignatura: </w:t>
+      </w:r>
+      <w:proofErr w:type="spellStart"/>
+      <w:r>
+        <w:rPr>
+          <w:rFonts w:ascii="Calibri" w:hAnsi="Calibri"/>
+          <w:color w:val="000000"/>
+        </w:rPr>
+        <w:t>Capstone</w:t>
+      </w:r>
+      <w:proofErr w:type="spellEnd"/>
+      <w:r>
+        <w:rPr>
+          <w:rFonts w:ascii="Calibri" w:hAnsi="Calibri"/>
+          <w:color w:val="000000"/>
+        </w:rPr>
+        <w:t xml:space="preserve"> PTY4614 | Sección: 001D | Docente: Diego Alberto Garcés Miranda.</w:t>
       </w:r>
     </w:p>
     <w:p>
@@ -679,31 +711,143 @@
                 <w:rFonts w:ascii="Calibri" w:hAnsi="Calibri"/>
                 <w:color w:val="000000"/>
               </w:rPr>
-              <w:t>La plataforma busca centralizar fichas académicas y coordinar clases, instructores y vehículos entre Macul y Peñalolén. El avance al 18 de octubre comprende un portal público en React, una pantalla de inicio de sesión visual, seis rutas de navegación y una API Express con 59 rutas de negocio vinculadas a nueve controllers y nueve services. Express también entrega la compilación del frontend desde el mismo servidor. [2, 6]</w:t>
-            </w:r>
-          </w:p>
-          <w:p>
-            <w:pPr>
-              <w:spacing w:after="100" w:line="240" w:lineRule="auto"/>
-            </w:pPr>
-            <w:r>
-              <w:rPr>
-                <w:rFonts w:ascii="Calibri" w:hAnsi="Calibri"/>
-                <w:color w:val="000000"/>
-              </w:rPr>
-              <w:t>Se documentó el almacenamiento mediante SQL MySQL, modelo Workbench, diccionario de datos y diagrama de entidades: nueve tablas, 65 campos y 14 relaciones. Existen backlog priorizado, tablero y seis casos de prueba del Sprint 1. El commit local f90f82f coincide con HEAD remoto de GitHub al corte. [3, 5, 7–9]</w:t>
-            </w:r>
-          </w:p>
-          <w:p>
-            <w:pPr>
-              <w:spacing w:after="100" w:line="240" w:lineRule="auto"/>
-            </w:pPr>
-            <w:r>
-              <w:rPr>
-                <w:rFonts w:ascii="Calibri" w:hAnsi="Calibri"/>
-                <w:color w:val="000000"/>
-              </w:rPr>
-              <w:t>Se alcanzó la base de construcción modular, diseño de datos y entrega técnica del frontend. La operación completa aún está en curso: cuatro pantallas muestran Próximamente, el login no consume la API y falta comprobar persistencia, autorización y concurrencia. Estos objetivos no se consideran terminados. [6, 10]</w:t>
+              <w:t xml:space="preserve">La plataforma busca centralizar fichas académicas y coordinar clases, instructores y vehículos entre Macul y Peñalolén. El avance al 18 de octubre comprende un portal público en </w:t>
+            </w:r>
+            <w:proofErr w:type="spellStart"/>
+            <w:r>
+              <w:rPr>
+                <w:rFonts w:ascii="Calibri" w:hAnsi="Calibri"/>
+                <w:color w:val="000000"/>
+              </w:rPr>
+              <w:t>React</w:t>
+            </w:r>
+            <w:proofErr w:type="spellEnd"/>
+            <w:r>
+              <w:rPr>
+                <w:rFonts w:ascii="Calibri" w:hAnsi="Calibri"/>
+                <w:color w:val="000000"/>
+              </w:rPr>
+              <w:t xml:space="preserve">, una pantalla de inicio de sesión visual, seis rutas de navegación y una API Express con 59 rutas de negocio vinculadas a nueve </w:t>
+            </w:r>
+            <w:proofErr w:type="spellStart"/>
+            <w:r>
+              <w:rPr>
+                <w:rFonts w:ascii="Calibri" w:hAnsi="Calibri"/>
+                <w:color w:val="000000"/>
+              </w:rPr>
+              <w:t>controllers</w:t>
+            </w:r>
+            <w:proofErr w:type="spellEnd"/>
+            <w:r>
+              <w:rPr>
+                <w:rFonts w:ascii="Calibri" w:hAnsi="Calibri"/>
+                <w:color w:val="000000"/>
+              </w:rPr>
+              <w:t xml:space="preserve"> y nueve </w:t>
+            </w:r>
+            <w:proofErr w:type="spellStart"/>
+            <w:r>
+              <w:rPr>
+                <w:rFonts w:ascii="Calibri" w:hAnsi="Calibri"/>
+                <w:color w:val="000000"/>
+              </w:rPr>
+              <w:t>services</w:t>
+            </w:r>
+            <w:proofErr w:type="spellEnd"/>
+            <w:r>
+              <w:rPr>
+                <w:rFonts w:ascii="Calibri" w:hAnsi="Calibri"/>
+                <w:color w:val="000000"/>
+              </w:rPr>
+              <w:t xml:space="preserve">. Express también entrega la compilación del </w:t>
+            </w:r>
+            <w:proofErr w:type="spellStart"/>
+            <w:r>
+              <w:rPr>
+                <w:rFonts w:ascii="Calibri" w:hAnsi="Calibri"/>
+                <w:color w:val="000000"/>
+              </w:rPr>
+              <w:t>frontend</w:t>
+            </w:r>
+            <w:proofErr w:type="spellEnd"/>
+            <w:r>
+              <w:rPr>
+                <w:rFonts w:ascii="Calibri" w:hAnsi="Calibri"/>
+                <w:color w:val="000000"/>
+              </w:rPr>
+              <w:t xml:space="preserve"> desde el mismo servidor. [2, 6]</w:t>
+            </w:r>
+          </w:p>
+          <w:p>
+            <w:pPr>
+              <w:spacing w:after="100" w:line="240" w:lineRule="auto"/>
+            </w:pPr>
+            <w:r>
+              <w:rPr>
+                <w:rFonts w:ascii="Calibri" w:hAnsi="Calibri"/>
+                <w:color w:val="000000"/>
+              </w:rPr>
+              <w:t xml:space="preserve">Se documentó el almacenamiento mediante SQL MySQL, modelo </w:t>
+            </w:r>
+            <w:proofErr w:type="spellStart"/>
+            <w:r>
+              <w:rPr>
+                <w:rFonts w:ascii="Calibri" w:hAnsi="Calibri"/>
+                <w:color w:val="000000"/>
+              </w:rPr>
+              <w:t>Workbench</w:t>
+            </w:r>
+            <w:proofErr w:type="spellEnd"/>
+            <w:r>
+              <w:rPr>
+                <w:rFonts w:ascii="Calibri" w:hAnsi="Calibri"/>
+                <w:color w:val="000000"/>
+              </w:rPr>
+              <w:t xml:space="preserve">, diccionario de datos y diagrama de entidades: nueve tablas, 65 campos y 14 relaciones. Existen backlog priorizado, tablero y seis casos de prueba del Sprint 1. El </w:t>
+            </w:r>
+            <w:proofErr w:type="spellStart"/>
+            <w:r>
+              <w:rPr>
+                <w:rFonts w:ascii="Calibri" w:hAnsi="Calibri"/>
+                <w:color w:val="000000"/>
+              </w:rPr>
+              <w:t>commit</w:t>
+            </w:r>
+            <w:proofErr w:type="spellEnd"/>
+            <w:r>
+              <w:rPr>
+                <w:rFonts w:ascii="Calibri" w:hAnsi="Calibri"/>
+                <w:color w:val="000000"/>
+              </w:rPr>
+              <w:t xml:space="preserve"> local f90f82f coincide con HEAD remoto de GitHub al corte. [3, 5, 7–9]</w:t>
+            </w:r>
+          </w:p>
+          <w:p>
+            <w:pPr>
+              <w:spacing w:after="100" w:line="240" w:lineRule="auto"/>
+            </w:pPr>
+            <w:r>
+              <w:rPr>
+                <w:rFonts w:ascii="Calibri" w:hAnsi="Calibri"/>
+                <w:color w:val="000000"/>
+              </w:rPr>
+              <w:t xml:space="preserve">Se alcanzó la base de construcción modular, diseño de datos y entrega técnica del </w:t>
+            </w:r>
+            <w:proofErr w:type="spellStart"/>
+            <w:r>
+              <w:rPr>
+                <w:rFonts w:ascii="Calibri" w:hAnsi="Calibri"/>
+                <w:color w:val="000000"/>
+              </w:rPr>
+              <w:t>frontend</w:t>
+            </w:r>
+            <w:proofErr w:type="spellEnd"/>
+            <w:r>
+              <w:rPr>
+                <w:rFonts w:ascii="Calibri" w:hAnsi="Calibri"/>
+                <w:color w:val="000000"/>
+              </w:rPr>
+              <w:t>. La operación completa aún está en curso: cuatro pantallas muestran Próximamente, el login no consume la API y falta comprobar persistencia, autorización y concurrencia. Estos objetivos no se consideran terminados. [6, 10]</w:t>
             </w:r>
           </w:p>
         </w:tc>
@@ -748,19 +892,51 @@
                 <w:rFonts w:ascii="Calibri" w:hAnsi="Calibri"/>
                 <w:color w:val="000000"/>
               </w:rPr>
-              <w:t>Se mantiene el objetivo general de desarrollar una plataforma multisede para gestión académica y agendamiento dinámico. Se ajusta su verificación mediante objetivos de incremento concretos:</w:t>
-            </w:r>
-          </w:p>
-          <w:p>
-            <w:pPr>
-              <w:spacing w:after="100" w:line="240" w:lineRule="auto"/>
-            </w:pPr>
-            <w:r>
-              <w:rPr>
-                <w:rFonts w:ascii="Calibri" w:hAnsi="Calibri"/>
-                <w:color w:val="000000"/>
-              </w:rPr>
-              <w:t>1. Completar acceso autenticado y consulta de la ficha del alumno desde React hasta MySQL, con restricciones por rol y evidencias reproducibles.</w:t>
+              <w:t xml:space="preserve">Se mantiene el objetivo general de desarrollar una plataforma </w:t>
+            </w:r>
+            <w:proofErr w:type="spellStart"/>
+            <w:r>
+              <w:rPr>
+                <w:rFonts w:ascii="Calibri" w:hAnsi="Calibri"/>
+                <w:color w:val="000000"/>
+              </w:rPr>
+              <w:t>multisede</w:t>
+            </w:r>
+            <w:proofErr w:type="spellEnd"/>
+            <w:r>
+              <w:rPr>
+                <w:rFonts w:ascii="Calibri" w:hAnsi="Calibri"/>
+                <w:color w:val="000000"/>
+              </w:rPr>
+              <w:t xml:space="preserve"> para gestión académica y agendamiento dinámico. Se ajusta su verificación mediante objetivos de incremento concretos:</w:t>
+            </w:r>
+          </w:p>
+          <w:p>
+            <w:pPr>
+              <w:spacing w:after="100" w:line="240" w:lineRule="auto"/>
+            </w:pPr>
+            <w:r>
+              <w:rPr>
+                <w:rFonts w:ascii="Calibri" w:hAnsi="Calibri"/>
+                <w:color w:val="000000"/>
+              </w:rPr>
+              <w:t xml:space="preserve">1. Completar acceso autenticado y consulta de la ficha del alumno desde </w:t>
+            </w:r>
+            <w:proofErr w:type="spellStart"/>
+            <w:r>
+              <w:rPr>
+                <w:rFonts w:ascii="Calibri" w:hAnsi="Calibri"/>
+                <w:color w:val="000000"/>
+              </w:rPr>
+              <w:t>React</w:t>
+            </w:r>
+            <w:proofErr w:type="spellEnd"/>
+            <w:r>
+              <w:rPr>
+                <w:rFonts w:ascii="Calibri" w:hAnsi="Calibri"/>
+                <w:color w:val="000000"/>
+              </w:rPr>
+              <w:t xml:space="preserve"> hasta MySQL, con restricciones por rol y evidencias reproducibles.</w:t>
             </w:r>
           </w:p>
           <w:p>
@@ -784,7 +960,23 @@
                 <w:rFonts w:ascii="Calibri" w:hAnsi="Calibri"/>
                 <w:color w:val="000000"/>
               </w:rPr>
-              <w:t>3. Relacionar cada historia con responsable, commit y resultado de aceptación. Evaluar pagos, comprobantes y reportes como ampliaciones del backlog, con estimación y aprobación previa; no se declaran implementados. [2–4, 11]</w:t>
+              <w:t xml:space="preserve">3. Relacionar cada historia con responsable, </w:t>
+            </w:r>
+            <w:proofErr w:type="spellStart"/>
+            <w:r>
+              <w:rPr>
+                <w:rFonts w:ascii="Calibri" w:hAnsi="Calibri"/>
+                <w:color w:val="000000"/>
+              </w:rPr>
+              <w:t>commit</w:t>
+            </w:r>
+            <w:proofErr w:type="spellEnd"/>
+            <w:r>
+              <w:rPr>
+                <w:rFonts w:ascii="Calibri" w:hAnsi="Calibri"/>
+                <w:color w:val="000000"/>
+              </w:rPr>
+              <w:t xml:space="preserve"> y resultado de aceptación. Evaluar pagos, comprobantes y reportes como ampliaciones del backlog, con estimación y aprobación previa; no se declaran implementados. [2–4, 11]</w:t>
             </w:r>
           </w:p>
         </w:tc>
@@ -840,7 +1032,55 @@
                 <w:rFonts w:ascii="Calibri" w:hAnsi="Calibri"/>
                 <w:color w:val="000000"/>
               </w:rPr>
-              <w:t>Ajuste propuesto a la Definition of Done: criterio de aceptación cumplido, interfaz conectada cuando corresponda, persistencia y permisos comprobados, casos positivo y negativo documentados, revisión de un compañero y evidencia con autor, fecha y commit. Se debe completar el registro de revisión y retrospectiva antes de cerrar el incremento. [2, 11]</w:t>
+              <w:t xml:space="preserve">Ajuste propuesto a la </w:t>
+            </w:r>
+            <w:proofErr w:type="spellStart"/>
+            <w:r>
+              <w:rPr>
+                <w:rFonts w:ascii="Calibri" w:hAnsi="Calibri"/>
+                <w:color w:val="000000"/>
+              </w:rPr>
+              <w:t>Definition</w:t>
+            </w:r>
+            <w:proofErr w:type="spellEnd"/>
+            <w:r>
+              <w:rPr>
+                <w:rFonts w:ascii="Calibri" w:hAnsi="Calibri"/>
+                <w:color w:val="000000"/>
+              </w:rPr>
+              <w:t xml:space="preserve"> </w:t>
+            </w:r>
+            <w:proofErr w:type="spellStart"/>
+            <w:r>
+              <w:rPr>
+                <w:rFonts w:ascii="Calibri" w:hAnsi="Calibri"/>
+                <w:color w:val="000000"/>
+              </w:rPr>
+              <w:t>of</w:t>
+            </w:r>
+            <w:proofErr w:type="spellEnd"/>
+            <w:r>
+              <w:rPr>
+                <w:rFonts w:ascii="Calibri" w:hAnsi="Calibri"/>
+                <w:color w:val="000000"/>
+              </w:rPr>
+              <w:t xml:space="preserve"> Done: criterio de aceptación cumplido, interfaz conectada cuando corresponda, persistencia y permisos comprobados, casos positivo y negativo documentados, revisión de un compañero y evidencia con autor, fecha y </w:t>
+            </w:r>
+            <w:proofErr w:type="spellStart"/>
+            <w:r>
+              <w:rPr>
+                <w:rFonts w:ascii="Calibri" w:hAnsi="Calibri"/>
+                <w:color w:val="000000"/>
+              </w:rPr>
+              <w:t>commit</w:t>
+            </w:r>
+            <w:proofErr w:type="spellEnd"/>
+            <w:r>
+              <w:rPr>
+                <w:rFonts w:ascii="Calibri" w:hAnsi="Calibri"/>
+                <w:color w:val="000000"/>
+              </w:rPr>
+              <w:t>. Se debe completar el registro de revisión y retrospectiva antes de cerrar el incremento. [2, 11]</w:t>
             </w:r>
           </w:p>
         </w:tc>
@@ -884,55 +1124,407 @@
                 <w:rFonts w:ascii="Calibri" w:hAnsi="Calibri"/>
                 <w:color w:val="000000"/>
               </w:rPr>
-              <w:t>E1 Documentación y seguimiento. Guía de Fase 1, Product Backlog, User Story Mapping, plan del Sprint 1 y capturas del backlog y Scrumboard. Relacionan objetivos, prioridades, responsables y criterios. Las capturas adjuntas en el anexo C son históricas. [2–5, 8]</w:t>
-            </w:r>
-          </w:p>
-          <w:p>
-            <w:pPr>
-              <w:spacing w:after="100" w:line="240" w:lineRule="auto"/>
-            </w:pPr>
-            <w:r>
-              <w:rPr>
-                <w:rFonts w:ascii="Calibri" w:hAnsi="Calibri"/>
-                <w:color w:val="000000"/>
-              </w:rPr>
-              <w:t>E2 Programación. Commit cabedeb: services y controllers; cfe98b7: 59 rutas e integración de React con Express; 14d21f3, 7b5c4d0 y 0435131: desarrollo de presentación. Se verifica separación routes → controllers → services → pool MySQL y consultas parametrizadas. Las pantallas privadas siguen pendientes. [6, 9]</w:t>
-            </w:r>
-          </w:p>
-          <w:p>
-            <w:pPr>
-              <w:spacing w:after="100" w:line="240" w:lineRule="auto"/>
-            </w:pPr>
-            <w:r>
-              <w:rPr>
-                <w:rFonts w:ascii="Calibri" w:hAnsi="Calibri"/>
-                <w:color w:val="000000"/>
-              </w:rPr>
-              <w:t>E3 Almacenamiento. Commit f90f82f: script_base_datos.sql, diccionario, modelo relacional y diagrama. Claves primarias, 14 relaciones, restricciones de unicidad e índices respaldan el diseño. La importación y persistencia en un motor real deben documentarse. [7]</w:t>
-            </w:r>
-          </w:p>
-          <w:p>
-            <w:pPr>
-              <w:spacing w:after="100" w:line="240" w:lineRule="auto"/>
-            </w:pPr>
-            <w:r>
-              <w:rPr>
-                <w:rFonts w:ascii="Calibri" w:hAnsi="Calibri"/>
-                <w:color w:val="000000"/>
-              </w:rPr>
-              <w:t>E4 Calidad al corte. El frontend compila con Vite y procesa 49 módulos; 32 archivos del backend superan revisión de sintaxis; 59 de 59 rutas despachan al método y parámetros correctos con controllers simulados; una ruta desconocida devuelve 404; 13 validaciones de controllers reales devuelven 400 ante entradas incompletas. Estas pruebas no ejecutan SQL ni certifican autorización, rendimiento o flujos completos. [10]</w:t>
-            </w:r>
-          </w:p>
-          <w:p>
-            <w:pPr>
-              <w:spacing w:after="100" w:line="240" w:lineRule="auto"/>
-            </w:pPr>
-            <w:r>
-              <w:rPr>
-                <w:rFonts w:ascii="Calibri" w:hAnsi="Calibri"/>
-                <w:color w:val="000000"/>
-              </w:rPr>
-              <w:t>E5 Aporte individual. Gabriel: backend, rutas e integración; Maximiliano: portal público e inicio visual; Máximo: diseño de seis casos de prueba, commit 3dcce51 bajo smhnaxho, identidad confirmada por Gabriel. El número de commits no acredita equidad por sí solo: se requieren historias, productos y revisiones por integrante. [5, 9, 11]</w:t>
+              <w:t xml:space="preserve">E1 Documentación y seguimiento. Guía de Fase 1, </w:t>
+            </w:r>
+            <w:proofErr w:type="spellStart"/>
+            <w:r>
+              <w:rPr>
+                <w:rFonts w:ascii="Calibri" w:hAnsi="Calibri"/>
+                <w:color w:val="000000"/>
+              </w:rPr>
+              <w:t>Product</w:t>
+            </w:r>
+            <w:proofErr w:type="spellEnd"/>
+            <w:r>
+              <w:rPr>
+                <w:rFonts w:ascii="Calibri" w:hAnsi="Calibri"/>
+                <w:color w:val="000000"/>
+              </w:rPr>
+              <w:t xml:space="preserve"> Backlog, </w:t>
+            </w:r>
+            <w:proofErr w:type="spellStart"/>
+            <w:r>
+              <w:rPr>
+                <w:rFonts w:ascii="Calibri" w:hAnsi="Calibri"/>
+                <w:color w:val="000000"/>
+              </w:rPr>
+              <w:t>User</w:t>
+            </w:r>
+            <w:proofErr w:type="spellEnd"/>
+            <w:r>
+              <w:rPr>
+                <w:rFonts w:ascii="Calibri" w:hAnsi="Calibri"/>
+                <w:color w:val="000000"/>
+              </w:rPr>
+              <w:t xml:space="preserve"> Story </w:t>
+            </w:r>
+            <w:proofErr w:type="spellStart"/>
+            <w:r>
+              <w:rPr>
+                <w:rFonts w:ascii="Calibri" w:hAnsi="Calibri"/>
+                <w:color w:val="000000"/>
+              </w:rPr>
+              <w:t>Mapping</w:t>
+            </w:r>
+            <w:proofErr w:type="spellEnd"/>
+            <w:r>
+              <w:rPr>
+                <w:rFonts w:ascii="Calibri" w:hAnsi="Calibri"/>
+                <w:color w:val="000000"/>
+              </w:rPr>
+              <w:t xml:space="preserve">, plan del Sprint 1 y capturas del backlog y </w:t>
+            </w:r>
+            <w:proofErr w:type="spellStart"/>
+            <w:r>
+              <w:rPr>
+                <w:rFonts w:ascii="Calibri" w:hAnsi="Calibri"/>
+                <w:color w:val="000000"/>
+              </w:rPr>
+              <w:t>Scrumboard</w:t>
+            </w:r>
+            <w:proofErr w:type="spellEnd"/>
+            <w:r>
+              <w:rPr>
+                <w:rFonts w:ascii="Calibri" w:hAnsi="Calibri"/>
+                <w:color w:val="000000"/>
+              </w:rPr>
+              <w:t>. Relacionan objetivos, prioridades, responsables y criterios. Las capturas adjuntas en el anexo C son históricas. [2–5, 8]</w:t>
+            </w:r>
+          </w:p>
+          <w:p>
+            <w:pPr>
+              <w:spacing w:after="100" w:line="240" w:lineRule="auto"/>
+            </w:pPr>
+            <w:r>
+              <w:rPr>
+                <w:rFonts w:ascii="Calibri" w:hAnsi="Calibri"/>
+                <w:color w:val="000000"/>
+              </w:rPr>
+              <w:t xml:space="preserve">E2 Programación. </w:t>
+            </w:r>
+            <w:proofErr w:type="spellStart"/>
+            <w:r>
+              <w:rPr>
+                <w:rFonts w:ascii="Calibri" w:hAnsi="Calibri"/>
+                <w:color w:val="000000"/>
+              </w:rPr>
+              <w:t>Commit</w:t>
+            </w:r>
+            <w:proofErr w:type="spellEnd"/>
+            <w:r>
+              <w:rPr>
+                <w:rFonts w:ascii="Calibri" w:hAnsi="Calibri"/>
+                <w:color w:val="000000"/>
+              </w:rPr>
+              <w:t xml:space="preserve"> </w:t>
+            </w:r>
+            <w:proofErr w:type="spellStart"/>
+            <w:r>
+              <w:rPr>
+                <w:rFonts w:ascii="Calibri" w:hAnsi="Calibri"/>
+                <w:color w:val="000000"/>
+              </w:rPr>
+              <w:t>cabedeb</w:t>
+            </w:r>
+            <w:proofErr w:type="spellEnd"/>
+            <w:r>
+              <w:rPr>
+                <w:rFonts w:ascii="Calibri" w:hAnsi="Calibri"/>
+                <w:color w:val="000000"/>
+              </w:rPr>
+              <w:t xml:space="preserve">: </w:t>
+            </w:r>
+            <w:proofErr w:type="spellStart"/>
+            <w:r>
+              <w:rPr>
+                <w:rFonts w:ascii="Calibri" w:hAnsi="Calibri"/>
+                <w:color w:val="000000"/>
+              </w:rPr>
+              <w:t>services</w:t>
+            </w:r>
+            <w:proofErr w:type="spellEnd"/>
+            <w:r>
+              <w:rPr>
+                <w:rFonts w:ascii="Calibri" w:hAnsi="Calibri"/>
+                <w:color w:val="000000"/>
+              </w:rPr>
+              <w:t xml:space="preserve"> y </w:t>
+            </w:r>
+            <w:proofErr w:type="spellStart"/>
+            <w:r>
+              <w:rPr>
+                <w:rFonts w:ascii="Calibri" w:hAnsi="Calibri"/>
+                <w:color w:val="000000"/>
+              </w:rPr>
+              <w:t>controllers</w:t>
+            </w:r>
+            <w:proofErr w:type="spellEnd"/>
+            <w:r>
+              <w:rPr>
+                <w:rFonts w:ascii="Calibri" w:hAnsi="Calibri"/>
+                <w:color w:val="000000"/>
+              </w:rPr>
+              <w:t xml:space="preserve">; cfe98b7: 59 rutas e integración de </w:t>
+            </w:r>
+            <w:proofErr w:type="spellStart"/>
+            <w:r>
+              <w:rPr>
+                <w:rFonts w:ascii="Calibri" w:hAnsi="Calibri"/>
+                <w:color w:val="000000"/>
+              </w:rPr>
+              <w:t>React</w:t>
+            </w:r>
+            <w:proofErr w:type="spellEnd"/>
+            <w:r>
+              <w:rPr>
+                <w:rFonts w:ascii="Calibri" w:hAnsi="Calibri"/>
+                <w:color w:val="000000"/>
+              </w:rPr>
+              <w:t xml:space="preserve"> con Express; 14d21f3, 7b5c4d0 y 0435131: desarrollo de presentación. Se verifica separación </w:t>
+            </w:r>
+            <w:proofErr w:type="spellStart"/>
+            <w:r>
+              <w:rPr>
+                <w:rFonts w:ascii="Calibri" w:hAnsi="Calibri"/>
+                <w:color w:val="000000"/>
+              </w:rPr>
+              <w:t>routes</w:t>
+            </w:r>
+            <w:proofErr w:type="spellEnd"/>
+            <w:r>
+              <w:rPr>
+                <w:rFonts w:ascii="Calibri" w:hAnsi="Calibri"/>
+                <w:color w:val="000000"/>
+              </w:rPr>
+              <w:t xml:space="preserve"> → </w:t>
+            </w:r>
+            <w:proofErr w:type="spellStart"/>
+            <w:r>
+              <w:rPr>
+                <w:rFonts w:ascii="Calibri" w:hAnsi="Calibri"/>
+                <w:color w:val="000000"/>
+              </w:rPr>
+              <w:t>controllers</w:t>
+            </w:r>
+            <w:proofErr w:type="spellEnd"/>
+            <w:r>
+              <w:rPr>
+                <w:rFonts w:ascii="Calibri" w:hAnsi="Calibri"/>
+                <w:color w:val="000000"/>
+              </w:rPr>
+              <w:t xml:space="preserve"> → </w:t>
+            </w:r>
+            <w:proofErr w:type="spellStart"/>
+            <w:r>
+              <w:rPr>
+                <w:rFonts w:ascii="Calibri" w:hAnsi="Calibri"/>
+                <w:color w:val="000000"/>
+              </w:rPr>
+              <w:t>services</w:t>
+            </w:r>
+            <w:proofErr w:type="spellEnd"/>
+            <w:r>
+              <w:rPr>
+                <w:rFonts w:ascii="Calibri" w:hAnsi="Calibri"/>
+                <w:color w:val="000000"/>
+              </w:rPr>
+              <w:t xml:space="preserve"> → pool MySQL y consultas parametrizadas. Las pantallas privadas siguen pendientes. [6, 9]</w:t>
+            </w:r>
+          </w:p>
+          <w:p>
+            <w:pPr>
+              <w:spacing w:after="100" w:line="240" w:lineRule="auto"/>
+            </w:pPr>
+            <w:r>
+              <w:rPr>
+                <w:rFonts w:ascii="Calibri" w:hAnsi="Calibri"/>
+                <w:color w:val="000000"/>
+              </w:rPr>
+              <w:t xml:space="preserve">E3 Almacenamiento. </w:t>
+            </w:r>
+            <w:proofErr w:type="spellStart"/>
+            <w:r>
+              <w:rPr>
+                <w:rFonts w:ascii="Calibri" w:hAnsi="Calibri"/>
+                <w:color w:val="000000"/>
+              </w:rPr>
+              <w:t>Commit</w:t>
+            </w:r>
+            <w:proofErr w:type="spellEnd"/>
+            <w:r>
+              <w:rPr>
+                <w:rFonts w:ascii="Calibri" w:hAnsi="Calibri"/>
+                <w:color w:val="000000"/>
+              </w:rPr>
+              <w:t xml:space="preserve"> f90f82f: </w:t>
+            </w:r>
+            <w:proofErr w:type="spellStart"/>
+            <w:r>
+              <w:rPr>
+                <w:rFonts w:ascii="Calibri" w:hAnsi="Calibri"/>
+                <w:color w:val="000000"/>
+              </w:rPr>
+              <w:t>script_base_datos.sql</w:t>
+            </w:r>
+            <w:proofErr w:type="spellEnd"/>
+            <w:r>
+              <w:rPr>
+                <w:rFonts w:ascii="Calibri" w:hAnsi="Calibri"/>
+                <w:color w:val="000000"/>
+              </w:rPr>
+              <w:t>, diccionario, modelo relacional y diagrama. Claves primarias, 14 relaciones, restricciones de unicidad e índices respaldan el diseño. La importación y persistencia en un motor real deben documentarse. [7]</w:t>
+            </w:r>
+          </w:p>
+          <w:p>
+            <w:pPr>
+              <w:spacing w:after="100" w:line="240" w:lineRule="auto"/>
+            </w:pPr>
+            <w:r>
+              <w:rPr>
+                <w:rFonts w:ascii="Calibri" w:hAnsi="Calibri"/>
+                <w:color w:val="000000"/>
+              </w:rPr>
+              <w:t xml:space="preserve">E4 Calidad al corte. El </w:t>
+            </w:r>
+            <w:proofErr w:type="spellStart"/>
+            <w:r>
+              <w:rPr>
+                <w:rFonts w:ascii="Calibri" w:hAnsi="Calibri"/>
+                <w:color w:val="000000"/>
+              </w:rPr>
+              <w:t>frontend</w:t>
+            </w:r>
+            <w:proofErr w:type="spellEnd"/>
+            <w:r>
+              <w:rPr>
+                <w:rFonts w:ascii="Calibri" w:hAnsi="Calibri"/>
+                <w:color w:val="000000"/>
+              </w:rPr>
+              <w:t xml:space="preserve"> compila con Vite y procesa 49 módulos; 32 archivos del </w:t>
+            </w:r>
+            <w:proofErr w:type="spellStart"/>
+            <w:r>
+              <w:rPr>
+                <w:rFonts w:ascii="Calibri" w:hAnsi="Calibri"/>
+                <w:color w:val="000000"/>
+              </w:rPr>
+              <w:t>backend</w:t>
+            </w:r>
+            <w:proofErr w:type="spellEnd"/>
+            <w:r>
+              <w:rPr>
+                <w:rFonts w:ascii="Calibri" w:hAnsi="Calibri"/>
+                <w:color w:val="000000"/>
+              </w:rPr>
+              <w:t xml:space="preserve"> superan revisión de sintaxis; 59 de 59 rutas despachan al método y parámetros correctos con </w:t>
+            </w:r>
+            <w:proofErr w:type="spellStart"/>
+            <w:r>
+              <w:rPr>
+                <w:rFonts w:ascii="Calibri" w:hAnsi="Calibri"/>
+                <w:color w:val="000000"/>
+              </w:rPr>
+              <w:t>controllers</w:t>
+            </w:r>
+            <w:proofErr w:type="spellEnd"/>
+            <w:r>
+              <w:rPr>
+                <w:rFonts w:ascii="Calibri" w:hAnsi="Calibri"/>
+                <w:color w:val="000000"/>
+              </w:rPr>
+              <w:t xml:space="preserve"> simulados; una ruta desconocida devuelve 404; 13 validaciones de </w:t>
+            </w:r>
+            <w:proofErr w:type="spellStart"/>
+            <w:r>
+              <w:rPr>
+                <w:rFonts w:ascii="Calibri" w:hAnsi="Calibri"/>
+                <w:color w:val="000000"/>
+              </w:rPr>
+              <w:t>controllers</w:t>
+            </w:r>
+            <w:proofErr w:type="spellEnd"/>
+            <w:r>
+              <w:rPr>
+                <w:rFonts w:ascii="Calibri" w:hAnsi="Calibri"/>
+                <w:color w:val="000000"/>
+              </w:rPr>
+              <w:t xml:space="preserve"> reales devuelven 400 ante entradas incompletas. Estas pruebas no ejecutan SQL ni certifican autorización, rendimiento o flujos completos. [10]</w:t>
+            </w:r>
+          </w:p>
+          <w:p>
+            <w:pPr>
+              <w:spacing w:after="100" w:line="240" w:lineRule="auto"/>
+            </w:pPr>
+            <w:r>
+              <w:rPr>
+                <w:rFonts w:ascii="Calibri" w:hAnsi="Calibri"/>
+                <w:color w:val="000000"/>
+              </w:rPr>
+              <w:t xml:space="preserve">E5 Aporte individual. Gabriel: </w:t>
+            </w:r>
+            <w:proofErr w:type="spellStart"/>
+            <w:r>
+              <w:rPr>
+                <w:rFonts w:ascii="Calibri" w:hAnsi="Calibri"/>
+                <w:color w:val="000000"/>
+              </w:rPr>
+              <w:t>backend</w:t>
+            </w:r>
+            <w:proofErr w:type="spellEnd"/>
+            <w:r>
+              <w:rPr>
+                <w:rFonts w:ascii="Calibri" w:hAnsi="Calibri"/>
+                <w:color w:val="000000"/>
+              </w:rPr>
+              <w:t xml:space="preserve">, rutas e integración; Maximiliano: portal público e inicio visual; Máximo: diseño de seis casos de prueba, </w:t>
+            </w:r>
+            <w:proofErr w:type="spellStart"/>
+            <w:r>
+              <w:rPr>
+                <w:rFonts w:ascii="Calibri" w:hAnsi="Calibri"/>
+                <w:color w:val="000000"/>
+              </w:rPr>
+              <w:t>commit</w:t>
+            </w:r>
+            <w:proofErr w:type="spellEnd"/>
+            <w:r>
+              <w:rPr>
+                <w:rFonts w:ascii="Calibri" w:hAnsi="Calibri"/>
+                <w:color w:val="000000"/>
+              </w:rPr>
+              <w:t xml:space="preserve"> 3dcce51 bajo </w:t>
+            </w:r>
+            <w:proofErr w:type="spellStart"/>
+            <w:r>
+              <w:rPr>
+                <w:rFonts w:ascii="Calibri" w:hAnsi="Calibri"/>
+                <w:color w:val="000000"/>
+              </w:rPr>
+              <w:t>smhnaxho</w:t>
+            </w:r>
+            <w:proofErr w:type="spellEnd"/>
+            <w:r>
+              <w:rPr>
+                <w:rFonts w:ascii="Calibri" w:hAnsi="Calibri"/>
+                <w:color w:val="000000"/>
+              </w:rPr>
+              <w:t xml:space="preserve">, identidad confirmada por Gabriel. El número de </w:t>
+            </w:r>
+            <w:proofErr w:type="spellStart"/>
+            <w:r>
+              <w:rPr>
+                <w:rFonts w:ascii="Calibri" w:hAnsi="Calibri"/>
+                <w:color w:val="000000"/>
+              </w:rPr>
+              <w:t>commits</w:t>
+            </w:r>
+            <w:proofErr w:type="spellEnd"/>
+            <w:r>
+              <w:rPr>
+                <w:rFonts w:ascii="Calibri" w:hAnsi="Calibri"/>
+                <w:color w:val="000000"/>
+              </w:rPr>
+              <w:t xml:space="preserve"> no acredita equidad por sí solo: se requieren historias, productos y revisiones por integrante. [5, 9, 11]</w:t>
             </w:r>
           </w:p>
           <w:p>
@@ -945,7 +1537,23 @@
                 <w:color w:val="000000"/>
               </w:rPr>
               <w:lastRenderedPageBreak/>
-              <w:t>Las evidencias están localizadas en Fase 1/Evidencias Grupales y Fase 2/Evidencias Grupales y Codigo del repositorio. Este formulario y las nuevas comprobaciones deben incorporarse a Git para cerrar la evidencia de entrega. Los anexos incluyen el resumen bilingüe, conclusiones y reflexiones individuales, capturas y referencias. [1]</w:t>
+              <w:t xml:space="preserve">Las evidencias están localizadas en Fase 1/Evidencias Grupales y Fase 2/Evidencias Grupales y </w:t>
+            </w:r>
+            <w:proofErr w:type="spellStart"/>
+            <w:r>
+              <w:rPr>
+                <w:rFonts w:ascii="Calibri" w:hAnsi="Calibri"/>
+                <w:color w:val="000000"/>
+              </w:rPr>
+              <w:t>Codigo</w:t>
+            </w:r>
+            <w:proofErr w:type="spellEnd"/>
+            <w:r>
+              <w:rPr>
+                <w:rFonts w:ascii="Calibri" w:hAnsi="Calibri"/>
+                <w:color w:val="000000"/>
+              </w:rPr>
+              <w:t xml:space="preserve"> del repositorio. Este formulario y las nuevas comprobaciones deben incorporarse a Git para cerrar la evidencia de entrega. Los anexos incluyen el resumen bilingüe, conclusiones y reflexiones individuales, capturas y referencias. [1]</w:t>
             </w:r>
           </w:p>
         </w:tc>
@@ -1546,7 +2154,25 @@
                 <w:color w:val="000000"/>
                 <w:sz w:val="18"/>
               </w:rPr>
-              <w:t>MySQL, Workbench y diccionario.</w:t>
+              <w:t xml:space="preserve">MySQL, </w:t>
+            </w:r>
+            <w:proofErr w:type="spellStart"/>
+            <w:r>
+              <w:rPr>
+                <w:rFonts w:ascii="Calibri" w:hAnsi="Calibri"/>
+                <w:color w:val="000000"/>
+                <w:sz w:val="18"/>
+              </w:rPr>
+              <w:t>Workbench</w:t>
+            </w:r>
+            <w:proofErr w:type="spellEnd"/>
+            <w:r>
+              <w:rPr>
+                <w:rFonts w:ascii="Calibri" w:hAnsi="Calibri"/>
+                <w:color w:val="000000"/>
+                <w:sz w:val="18"/>
+              </w:rPr>
+              <w:t xml:space="preserve"> y diccionario.</w:t>
             </w:r>
           </w:p>
         </w:tc>
@@ -1671,13 +2297,23 @@
             <w:pPr>
               <w:spacing w:after="100" w:line="240" w:lineRule="auto"/>
             </w:pPr>
-            <w:r>
-              <w:rPr>
-                <w:rFonts w:ascii="Calibri" w:hAnsi="Calibri"/>
-                <w:color w:val="000000"/>
-                <w:sz w:val="18"/>
-              </w:rPr>
-              <w:t>Frontend y API.</w:t>
+            <w:proofErr w:type="spellStart"/>
+            <w:r>
+              <w:rPr>
+                <w:rFonts w:ascii="Calibri" w:hAnsi="Calibri"/>
+                <w:color w:val="000000"/>
+                <w:sz w:val="18"/>
+              </w:rPr>
+              <w:t>Frontend</w:t>
+            </w:r>
+            <w:proofErr w:type="spellEnd"/>
+            <w:r>
+              <w:rPr>
+                <w:rFonts w:ascii="Calibri" w:hAnsi="Calibri"/>
+                <w:color w:val="000000"/>
+                <w:sz w:val="18"/>
+              </w:rPr>
+              <w:t xml:space="preserve"> y API.</w:t>
             </w:r>
           </w:p>
         </w:tc>
@@ -1735,7 +2371,25 @@
                 <w:color w:val="000000"/>
                 <w:sz w:val="18"/>
               </w:rPr>
-              <w:t>Gabriel Godoy y Máximo Ortega; apoyo de Maximiliano Valdebenito en frontend.</w:t>
+              <w:t xml:space="preserve">Gabriel Godoy y Máximo Ortega; apoyo de Maximiliano Valdebenito en </w:t>
+            </w:r>
+            <w:proofErr w:type="spellStart"/>
+            <w:r>
+              <w:rPr>
+                <w:rFonts w:ascii="Calibri" w:hAnsi="Calibri"/>
+                <w:color w:val="000000"/>
+                <w:sz w:val="18"/>
+              </w:rPr>
+              <w:t>frontend</w:t>
+            </w:r>
+            <w:proofErr w:type="spellEnd"/>
+            <w:r>
+              <w:rPr>
+                <w:rFonts w:ascii="Calibri" w:hAnsi="Calibri"/>
+                <w:color w:val="000000"/>
+                <w:sz w:val="18"/>
+              </w:rPr>
+              <w:t>.</w:t>
             </w:r>
           </w:p>
         </w:tc>
@@ -1938,7 +2592,25 @@
                 <w:color w:val="000000"/>
                 <w:sz w:val="18"/>
               </w:rPr>
-              <w:t>Roles y tests.</w:t>
+              <w:t xml:space="preserve">Roles y </w:t>
+            </w:r>
+            <w:proofErr w:type="spellStart"/>
+            <w:r>
+              <w:rPr>
+                <w:rFonts w:ascii="Calibri" w:hAnsi="Calibri"/>
+                <w:color w:val="000000"/>
+                <w:sz w:val="18"/>
+              </w:rPr>
+              <w:t>tests</w:t>
+            </w:r>
+            <w:proofErr w:type="spellEnd"/>
+            <w:r>
+              <w:rPr>
+                <w:rFonts w:ascii="Calibri" w:hAnsi="Calibri"/>
+                <w:color w:val="000000"/>
+                <w:sz w:val="18"/>
+              </w:rPr>
+              <w:t>.</w:t>
             </w:r>
           </w:p>
         </w:tc>
@@ -1991,13 +2663,23 @@
             <w:pPr>
               <w:spacing w:after="100" w:line="240" w:lineRule="auto"/>
             </w:pPr>
-            <w:r>
-              <w:rPr>
-                <w:rFonts w:ascii="Calibri" w:hAnsi="Calibri"/>
-                <w:color w:val="000000"/>
-                <w:sz w:val="18"/>
-              </w:rPr>
-              <w:t>Services, API y datos de prueba.</w:t>
+            <w:proofErr w:type="spellStart"/>
+            <w:r>
+              <w:rPr>
+                <w:rFonts w:ascii="Calibri" w:hAnsi="Calibri"/>
+                <w:color w:val="000000"/>
+                <w:sz w:val="18"/>
+              </w:rPr>
+              <w:t>Services</w:t>
+            </w:r>
+            <w:proofErr w:type="spellEnd"/>
+            <w:r>
+              <w:rPr>
+                <w:rFonts w:ascii="Calibri" w:hAnsi="Calibri"/>
+                <w:color w:val="000000"/>
+                <w:sz w:val="18"/>
+              </w:rPr>
+              <w:t>, API y datos de prueba.</w:t>
             </w:r>
           </w:p>
         </w:tc>
@@ -2051,7 +2733,25 @@
                 <w:color w:val="000000"/>
                 <w:sz w:val="18"/>
               </w:rPr>
-              <w:t>Validaciones en backend; falta integración.</w:t>
+              <w:t xml:space="preserve">Validaciones en </w:t>
+            </w:r>
+            <w:proofErr w:type="spellStart"/>
+            <w:r>
+              <w:rPr>
+                <w:rFonts w:ascii="Calibri" w:hAnsi="Calibri"/>
+                <w:color w:val="000000"/>
+                <w:sz w:val="18"/>
+              </w:rPr>
+              <w:t>backend</w:t>
+            </w:r>
+            <w:proofErr w:type="spellEnd"/>
+            <w:r>
+              <w:rPr>
+                <w:rFonts w:ascii="Calibri" w:hAnsi="Calibri"/>
+                <w:color w:val="000000"/>
+                <w:sz w:val="18"/>
+              </w:rPr>
+              <w:t>; falta integración.</w:t>
             </w:r>
           </w:p>
         </w:tc>
@@ -2606,19 +3306,115 @@
                 <w:rFonts w:ascii="Calibri" w:hAnsi="Calibri"/>
                 <w:color w:val="000000"/>
               </w:rPr>
-              <w:t>Facilitadores. El modelo de datos, el backlog y los roles definidos reducen la ambigüedad; Git permite revisar cambios y aportes. React/Vite y Express facilitan construir e integrar por módulos. La incorporación de las rutas y del contenido estático al backend simplifica la demostración del avance. [2, 3, 6, 9]</w:t>
-            </w:r>
-          </w:p>
-          <w:p>
-            <w:pPr>
-              <w:spacing w:after="100" w:line="240" w:lineRule="auto"/>
-            </w:pPr>
-            <w:r>
-              <w:rPr>
-                <w:rFonts w:ascii="Calibri" w:hAnsi="Calibri"/>
-                <w:color w:val="000000"/>
-              </w:rPr>
-              <w:t>Dificultades técnicas. El backend utiliza MySQL y el DDL crea escuela_conductores, mientras Docker configura PostgreSQL y db.js usa escuela_futuro_db por defecto. Hay además diferencias de mayúsculas entre el DDL y los services. Acción propuesta: acordar MySQL como entorno coherente con el código, unificar nombres y comprobar instalación e importación con datos de prueba. [6, 7]</w:t>
+              <w:t xml:space="preserve">Facilitadores. El modelo de datos, el backlog y los roles definidos reducen la ambigüedad; Git permite revisar cambios y aportes. </w:t>
+            </w:r>
+            <w:proofErr w:type="spellStart"/>
+            <w:r>
+              <w:rPr>
+                <w:rFonts w:ascii="Calibri" w:hAnsi="Calibri"/>
+                <w:color w:val="000000"/>
+              </w:rPr>
+              <w:t>React</w:t>
+            </w:r>
+            <w:proofErr w:type="spellEnd"/>
+            <w:r>
+              <w:rPr>
+                <w:rFonts w:ascii="Calibri" w:hAnsi="Calibri"/>
+                <w:color w:val="000000"/>
+              </w:rPr>
+              <w:t xml:space="preserve">/Vite y Express facilitan construir e integrar por módulos. La incorporación de las rutas y del contenido estático al </w:t>
+            </w:r>
+            <w:proofErr w:type="spellStart"/>
+            <w:r>
+              <w:rPr>
+                <w:rFonts w:ascii="Calibri" w:hAnsi="Calibri"/>
+                <w:color w:val="000000"/>
+              </w:rPr>
+              <w:t>backend</w:t>
+            </w:r>
+            <w:proofErr w:type="spellEnd"/>
+            <w:r>
+              <w:rPr>
+                <w:rFonts w:ascii="Calibri" w:hAnsi="Calibri"/>
+                <w:color w:val="000000"/>
+              </w:rPr>
+              <w:t xml:space="preserve"> simplifica la demostración del avance. [2, 3, 6, 9]</w:t>
+            </w:r>
+          </w:p>
+          <w:p>
+            <w:pPr>
+              <w:spacing w:after="100" w:line="240" w:lineRule="auto"/>
+            </w:pPr>
+            <w:r>
+              <w:rPr>
+                <w:rFonts w:ascii="Calibri" w:hAnsi="Calibri"/>
+                <w:color w:val="000000"/>
+              </w:rPr>
+              <w:t xml:space="preserve">Dificultades técnicas. El </w:t>
+            </w:r>
+            <w:proofErr w:type="spellStart"/>
+            <w:r>
+              <w:rPr>
+                <w:rFonts w:ascii="Calibri" w:hAnsi="Calibri"/>
+                <w:color w:val="000000"/>
+              </w:rPr>
+              <w:t>backend</w:t>
+            </w:r>
+            <w:proofErr w:type="spellEnd"/>
+            <w:r>
+              <w:rPr>
+                <w:rFonts w:ascii="Calibri" w:hAnsi="Calibri"/>
+                <w:color w:val="000000"/>
+              </w:rPr>
+              <w:t xml:space="preserve"> utiliza MySQL y el DDL crea </w:t>
+            </w:r>
+            <w:proofErr w:type="spellStart"/>
+            <w:r>
+              <w:rPr>
+                <w:rFonts w:ascii="Calibri" w:hAnsi="Calibri"/>
+                <w:color w:val="000000"/>
+              </w:rPr>
+              <w:t>escuela_conductores</w:t>
+            </w:r>
+            <w:proofErr w:type="spellEnd"/>
+            <w:r>
+              <w:rPr>
+                <w:rFonts w:ascii="Calibri" w:hAnsi="Calibri"/>
+                <w:color w:val="000000"/>
+              </w:rPr>
+              <w:t xml:space="preserve">, mientras Docker configura PostgreSQL y db.js usa </w:t>
+            </w:r>
+            <w:proofErr w:type="spellStart"/>
+            <w:r>
+              <w:rPr>
+                <w:rFonts w:ascii="Calibri" w:hAnsi="Calibri"/>
+                <w:color w:val="000000"/>
+              </w:rPr>
+              <w:t>escuela_futuro_db</w:t>
+            </w:r>
+            <w:proofErr w:type="spellEnd"/>
+            <w:r>
+              <w:rPr>
+                <w:rFonts w:ascii="Calibri" w:hAnsi="Calibri"/>
+                <w:color w:val="000000"/>
+              </w:rPr>
+              <w:t xml:space="preserve"> por defecto. Hay además diferencias de mayúsculas entre el DDL y los </w:t>
+            </w:r>
+            <w:proofErr w:type="spellStart"/>
+            <w:r>
+              <w:rPr>
+                <w:rFonts w:ascii="Calibri" w:hAnsi="Calibri"/>
+                <w:color w:val="000000"/>
+              </w:rPr>
+              <w:t>services</w:t>
+            </w:r>
+            <w:proofErr w:type="spellEnd"/>
+            <w:r>
+              <w:rPr>
+                <w:rFonts w:ascii="Calibri" w:hAnsi="Calibri"/>
+                <w:color w:val="000000"/>
+              </w:rPr>
+              <w:t>. Acción propuesta: acordar MySQL como entorno coherente con el código, unificar nombres y comprobar instalación e importación con datos de prueba. [6, 7]</w:t>
             </w:r>
           </w:p>
           <w:p>
@@ -2707,43 +3503,194 @@
                 <w:rFonts w:ascii="Calibri" w:hAnsi="Calibri"/>
                 <w:color w:val="000000"/>
               </w:rPr>
-              <w:t>Ajuste realizado. Se unificó la entrega del frontend y backend: prestart/predev preparan React y Express sirve dist, conservando las rutas /api y la recarga de navegación de React. El cambio está versionado en cfe98b7. [6, 9]</w:t>
-            </w:r>
-          </w:p>
-          <w:p>
-            <w:pPr>
-              <w:spacing w:after="100" w:line="240" w:lineRule="auto"/>
-            </w:pPr>
-            <w:r>
-              <w:rPr>
-                <w:rFonts w:ascii="Calibri" w:hAnsi="Calibri"/>
-                <w:color w:val="000000"/>
-              </w:rPr>
-              <w:t>Ajustes de planificación propuestos. Sustituir actividades amplias por entregables completos. Del 20 al 26 de octubre: alinear datos y completar acceso/ficha; Gabriel en entorno, Maximiliano en interfaz y Máximo en pruebas. Del 27 de octubre al 2 de noviembre: agenda, bloqueos y concurrencia con trabajo conjunto. Del 3 al 9 de noviembre: progreso y autogestión. Del 10 al 16 de noviembre: regresión, manual, evidencias y ensayo. Son ventanas propuestas para acordar con el equipo y el docente, no cambios aprobados al calendario académico.</w:t>
-            </w:r>
-          </w:p>
-          <w:p>
-            <w:pPr>
-              <w:spacing w:after="100" w:line="240" w:lineRule="auto"/>
-            </w:pPr>
-            <w:r>
-              <w:rPr>
-                <w:rFonts w:ascii="Calibri" w:hAnsi="Calibri"/>
-                <w:color w:val="000000"/>
-              </w:rPr>
-              <w:t>Ajuste de alcance. Se evaluarán pagos, comprobantes y reportes, ya presentes en User Story Mapping.xlsx, mediante requisitos, esfuerzo y criterios propios. Se mantiene la simplificación de notificaciones por enlace web descrita en Fase 1. Ninguna ampliación se presenta como implementada ni se elimina una actividad comprometida sin acuerdo. [2, 4, 11]</w:t>
-            </w:r>
-          </w:p>
-          <w:p>
-            <w:pPr>
-              <w:spacing w:after="100" w:line="240" w:lineRule="auto"/>
-            </w:pPr>
-            <w:r>
-              <w:rPr>
-                <w:rFonts w:ascii="Calibri" w:hAnsi="Calibri"/>
-                <w:color w:val="000000"/>
-              </w:rPr>
-              <w:t>Ajuste metodológico. Cada historia deberá vincular responsable, commit, criterio de aceptación y resultado. El cierre exige revisión cruzada y evidencias guardadas en Git, además de actualizar tablero y retrospectiva. [1, 2]</w:t>
+              <w:t xml:space="preserve">Ajuste realizado. Se unificó la entrega del </w:t>
+            </w:r>
+            <w:proofErr w:type="spellStart"/>
+            <w:r>
+              <w:rPr>
+                <w:rFonts w:ascii="Calibri" w:hAnsi="Calibri"/>
+                <w:color w:val="000000"/>
+              </w:rPr>
+              <w:t>frontend</w:t>
+            </w:r>
+            <w:proofErr w:type="spellEnd"/>
+            <w:r>
+              <w:rPr>
+                <w:rFonts w:ascii="Calibri" w:hAnsi="Calibri"/>
+                <w:color w:val="000000"/>
+              </w:rPr>
+              <w:t xml:space="preserve"> y </w:t>
+            </w:r>
+            <w:proofErr w:type="spellStart"/>
+            <w:r>
+              <w:rPr>
+                <w:rFonts w:ascii="Calibri" w:hAnsi="Calibri"/>
+                <w:color w:val="000000"/>
+              </w:rPr>
+              <w:t>backend</w:t>
+            </w:r>
+            <w:proofErr w:type="spellEnd"/>
+            <w:r>
+              <w:rPr>
+                <w:rFonts w:ascii="Calibri" w:hAnsi="Calibri"/>
+                <w:color w:val="000000"/>
+              </w:rPr>
+              <w:t xml:space="preserve">: </w:t>
+            </w:r>
+            <w:proofErr w:type="spellStart"/>
+            <w:r>
+              <w:rPr>
+                <w:rFonts w:ascii="Calibri" w:hAnsi="Calibri"/>
+                <w:color w:val="000000"/>
+              </w:rPr>
+              <w:t>prestart</w:t>
+            </w:r>
+            <w:proofErr w:type="spellEnd"/>
+            <w:r>
+              <w:rPr>
+                <w:rFonts w:ascii="Calibri" w:hAnsi="Calibri"/>
+                <w:color w:val="000000"/>
+              </w:rPr>
+              <w:t>/</w:t>
+            </w:r>
+            <w:proofErr w:type="spellStart"/>
+            <w:r>
+              <w:rPr>
+                <w:rFonts w:ascii="Calibri" w:hAnsi="Calibri"/>
+                <w:color w:val="000000"/>
+              </w:rPr>
+              <w:t>predev</w:t>
+            </w:r>
+            <w:proofErr w:type="spellEnd"/>
+            <w:r>
+              <w:rPr>
+                <w:rFonts w:ascii="Calibri" w:hAnsi="Calibri"/>
+                <w:color w:val="000000"/>
+              </w:rPr>
+              <w:t xml:space="preserve"> preparan </w:t>
+            </w:r>
+            <w:proofErr w:type="spellStart"/>
+            <w:r>
+              <w:rPr>
+                <w:rFonts w:ascii="Calibri" w:hAnsi="Calibri"/>
+                <w:color w:val="000000"/>
+              </w:rPr>
+              <w:t>React</w:t>
+            </w:r>
+            <w:proofErr w:type="spellEnd"/>
+            <w:r>
+              <w:rPr>
+                <w:rFonts w:ascii="Calibri" w:hAnsi="Calibri"/>
+                <w:color w:val="000000"/>
+              </w:rPr>
+              <w:t xml:space="preserve"> y Express sirve </w:t>
+            </w:r>
+            <w:proofErr w:type="spellStart"/>
+            <w:r>
+              <w:rPr>
+                <w:rFonts w:ascii="Calibri" w:hAnsi="Calibri"/>
+                <w:color w:val="000000"/>
+              </w:rPr>
+              <w:t>dist</w:t>
+            </w:r>
+            <w:proofErr w:type="spellEnd"/>
+            <w:r>
+              <w:rPr>
+                <w:rFonts w:ascii="Calibri" w:hAnsi="Calibri"/>
+                <w:color w:val="000000"/>
+              </w:rPr>
+              <w:t xml:space="preserve">, conservando las rutas /api y la recarga de navegación de </w:t>
+            </w:r>
+            <w:proofErr w:type="spellStart"/>
+            <w:r>
+              <w:rPr>
+                <w:rFonts w:ascii="Calibri" w:hAnsi="Calibri"/>
+                <w:color w:val="000000"/>
+              </w:rPr>
+              <w:t>React</w:t>
+            </w:r>
+            <w:proofErr w:type="spellEnd"/>
+            <w:r>
+              <w:rPr>
+                <w:rFonts w:ascii="Calibri" w:hAnsi="Calibri"/>
+                <w:color w:val="000000"/>
+              </w:rPr>
+              <w:t>. El cambio está versionado en cfe98b7. [6, 9]</w:t>
+            </w:r>
+          </w:p>
+          <w:p>
+            <w:pPr>
+              <w:spacing w:after="100" w:line="240" w:lineRule="auto"/>
+            </w:pPr>
+            <w:r>
+              <w:rPr>
+                <w:rFonts w:ascii="Calibri" w:hAnsi="Calibri"/>
+                <w:color w:val="000000"/>
+              </w:rPr>
+              <w:t>Ajustes de planificación propuestos. Sustituir actividades amplias por entregables completos. Del 20 al 26 de octubre: alinear datos y completar acceso/ficha; Gabriel en entorno, Maximiliano en interfaz y Máximo en pruebas. Del 27 de octubre al 2 de noviembre: agenda, bloqueos y concurrencia con trabajo conjunto. Del 3 al 9 de noviembre: progreso y autogestión. Del 10 al 16 de noviembre: regresión, manual, evidencias y ensayo. Son ventanas propuestas para acordar con el equipo y el docente, no cambios aprob</w:t>
+            </w:r>
+            <w:r>
+              <w:rPr>
+                <w:rFonts w:ascii="Calibri" w:hAnsi="Calibri"/>
+                <w:color w:val="000000"/>
+              </w:rPr>
+              <w:t>ados al calendario académico.</w:t>
+            </w:r>
+          </w:p>
+          <w:p>
+            <w:pPr>
+              <w:spacing w:after="100" w:line="240" w:lineRule="auto"/>
+            </w:pPr>
+            <w:r>
+              <w:rPr>
+                <w:rFonts w:ascii="Calibri" w:hAnsi="Calibri"/>
+                <w:color w:val="000000"/>
+              </w:rPr>
+              <w:t xml:space="preserve">Ajuste de alcance. Se evaluarán pagos, comprobantes y reportes, ya presentes en </w:t>
+            </w:r>
+            <w:proofErr w:type="spellStart"/>
+            <w:r>
+              <w:rPr>
+                <w:rFonts w:ascii="Calibri" w:hAnsi="Calibri"/>
+                <w:color w:val="000000"/>
+              </w:rPr>
+              <w:t>User</w:t>
+            </w:r>
+            <w:proofErr w:type="spellEnd"/>
+            <w:r>
+              <w:rPr>
+                <w:rFonts w:ascii="Calibri" w:hAnsi="Calibri"/>
+                <w:color w:val="000000"/>
+              </w:rPr>
+              <w:t xml:space="preserve"> Story Mapping.xlsx, mediante requisitos, esfuerzo y criterios propios. Se mantiene la simplificación de notificaciones por enlace web descrita en Fase 1. Ninguna ampliación se presenta como implementada ni se elimina una actividad comprometida sin acuerdo. [2, 4, 11]</w:t>
+            </w:r>
+          </w:p>
+          <w:p>
+            <w:pPr>
+              <w:spacing w:after="100" w:line="240" w:lineRule="auto"/>
+            </w:pPr>
+            <w:r>
+              <w:rPr>
+                <w:rFonts w:ascii="Calibri" w:hAnsi="Calibri"/>
+                <w:color w:val="000000"/>
+              </w:rPr>
+              <w:t xml:space="preserve">Ajuste metodológico. Cada historia deberá vincular responsable, </w:t>
+            </w:r>
+            <w:proofErr w:type="spellStart"/>
+            <w:r>
+              <w:rPr>
+                <w:rFonts w:ascii="Calibri" w:hAnsi="Calibri"/>
+                <w:color w:val="000000"/>
+              </w:rPr>
+              <w:t>commit</w:t>
+            </w:r>
+            <w:proofErr w:type="spellEnd"/>
+            <w:r>
+              <w:rPr>
+                <w:rFonts w:ascii="Calibri" w:hAnsi="Calibri"/>
+                <w:color w:val="000000"/>
+              </w:rPr>
+              <w:t>, criterio de aceptación y resultado. El cierre exige revisión cruzada y evidencias guardadas en Git, además de actualizar tablero y retrospectiva. [1, 2]</w:t>
             </w:r>
           </w:p>
         </w:tc>
@@ -2885,7 +3832,39 @@
                 <w:rFonts w:ascii="Calibri" w:hAnsi="Calibri"/>
                 <w:color w:val="000000"/>
               </w:rPr>
-              <w:t>Evidencia individual. Se confirmó la cuenta smhnaxho de Máximo para el plan del Sprint 1. Cada integrante debe completar sus evidencias de Fase 2 y revisar las de un compañero. La meta es demostrar participación y conocimiento compartido, no igualar artificialmente el número de commits. [1, 9, 11]</w:t>
+              <w:t xml:space="preserve">Evidencia individual. Se confirmó la cuenta </w:t>
+            </w:r>
+            <w:proofErr w:type="spellStart"/>
+            <w:r>
+              <w:rPr>
+                <w:rFonts w:ascii="Calibri" w:hAnsi="Calibri"/>
+                <w:color w:val="000000"/>
+              </w:rPr>
+              <w:t>smhnaxho</w:t>
+            </w:r>
+            <w:proofErr w:type="spellEnd"/>
+            <w:r>
+              <w:rPr>
+                <w:rFonts w:ascii="Calibri" w:hAnsi="Calibri"/>
+                <w:color w:val="000000"/>
+              </w:rPr>
+              <w:t xml:space="preserve"> de Máximo para el plan del Sprint 1. Cada integrante debe completar sus evidencias de Fase 2 y revisar las de un compañero. La meta es demostrar participación y conocimiento compartido, no igualar artificialmente el número de </w:t>
+            </w:r>
+            <w:proofErr w:type="spellStart"/>
+            <w:r>
+              <w:rPr>
+                <w:rFonts w:ascii="Calibri" w:hAnsi="Calibri"/>
+                <w:color w:val="000000"/>
+              </w:rPr>
+              <w:t>commits</w:t>
+            </w:r>
+            <w:proofErr w:type="spellEnd"/>
+            <w:r>
+              <w:rPr>
+                <w:rFonts w:ascii="Calibri" w:hAnsi="Calibri"/>
+                <w:color w:val="000000"/>
+              </w:rPr>
+              <w:t>. [1, 9, 11]</w:t>
             </w:r>
           </w:p>
         </w:tc>
@@ -3018,7 +3997,25 @@
           <w:b/>
           <w:color w:val="000000"/>
         </w:rPr>
-        <w:t>C2 Scrumboard de Semana 8</w:t>
+        <w:t xml:space="preserve">C2 </w:t>
+      </w:r>
+      <w:proofErr w:type="spellStart"/>
+      <w:r>
+        <w:rPr>
+          <w:rFonts w:ascii="Calibri" w:hAnsi="Calibri"/>
+          <w:b/>
+          <w:color w:val="000000"/>
+        </w:rPr>
+        <w:t>Scrumboard</w:t>
+      </w:r>
+      <w:proofErr w:type="spellEnd"/>
+      <w:r>
+        <w:rPr>
+          <w:rFonts w:ascii="Calibri" w:hAnsi="Calibri"/>
+          <w:b/>
+          <w:color w:val="000000"/>
+        </w:rPr>
+        <w:t xml:space="preserve"> de Semana 8</w:t>
       </w:r>
     </w:p>
     <w:p>
@@ -3169,7 +4166,39 @@
           <w:rFonts w:ascii="Calibri" w:hAnsi="Calibri"/>
           <w:color w:val="000000"/>
         </w:rPr>
-        <w:t>Diagrama derivado del SQL con nueve entidades y 14 asociaciones; sin métodos documentados. Fuente: equipo del proyecto, commit f90f82f. El diccionario y el archivo Workbench permiten consultar los atributos en detalle. [7]</w:t>
+        <w:t xml:space="preserve">Diagrama derivado del SQL con nueve entidades y 14 asociaciones; sin métodos documentados. Fuente: equipo del proyecto, </w:t>
+      </w:r>
+      <w:proofErr w:type="spellStart"/>
+      <w:r>
+        <w:rPr>
+          <w:rFonts w:ascii="Calibri" w:hAnsi="Calibri"/>
+          <w:color w:val="000000"/>
+        </w:rPr>
+        <w:t>commit</w:t>
+      </w:r>
+      <w:proofErr w:type="spellEnd"/>
+      <w:r>
+        <w:rPr>
+          <w:rFonts w:ascii="Calibri" w:hAnsi="Calibri"/>
+          <w:color w:val="000000"/>
+        </w:rPr>
+        <w:t xml:space="preserve"> f90f82f. El diccionario y el archivo </w:t>
+      </w:r>
+      <w:proofErr w:type="spellStart"/>
+      <w:r>
+        <w:rPr>
+          <w:rFonts w:ascii="Calibri" w:hAnsi="Calibri"/>
+          <w:color w:val="000000"/>
+        </w:rPr>
+        <w:t>Workbench</w:t>
+      </w:r>
+      <w:proofErr w:type="spellEnd"/>
+      <w:r>
+        <w:rPr>
+          <w:rFonts w:ascii="Calibri" w:hAnsi="Calibri"/>
+          <w:color w:val="000000"/>
+        </w:rPr>
+        <w:t xml:space="preserve"> permiten consultar los atributos en detalle. [7]</w:t>
       </w:r>
     </w:p>
     <w:p>
@@ -3181,7 +4210,39 @@
           <w:rFonts w:ascii="Calibri" w:hAnsi="Calibri"/>
           <w:color w:val="000000"/>
         </w:rPr>
-        <w:t>La API reúne 6 rutas de alumnos, 5 de asistencias, 5 de bloqueos, 7 de clases, 7 de evaluaciones, 5 de roles, 7 de sedes, 9 de usuarios y 8 de vehículos. El total es 59, más health y db-test. El conteo no implica aceptación funcional. [6, 10]</w:t>
+        <w:t xml:space="preserve">La API reúne 6 rutas de alumnos, 5 de asistencias, 5 de bloqueos, 7 de clases, 7 de evaluaciones, 5 de roles, 7 de sedes, 9 de usuarios y 8 de vehículos. El total es 59, más </w:t>
+      </w:r>
+      <w:proofErr w:type="spellStart"/>
+      <w:r>
+        <w:rPr>
+          <w:rFonts w:ascii="Calibri" w:hAnsi="Calibri"/>
+          <w:color w:val="000000"/>
+        </w:rPr>
+        <w:t>health</w:t>
+      </w:r>
+      <w:proofErr w:type="spellEnd"/>
+      <w:r>
+        <w:rPr>
+          <w:rFonts w:ascii="Calibri" w:hAnsi="Calibri"/>
+          <w:color w:val="000000"/>
+        </w:rPr>
+        <w:t xml:space="preserve"> y </w:t>
+      </w:r>
+      <w:proofErr w:type="spellStart"/>
+      <w:r>
+        <w:rPr>
+          <w:rFonts w:ascii="Calibri" w:hAnsi="Calibri"/>
+          <w:color w:val="000000"/>
+        </w:rPr>
+        <w:t>db</w:t>
+      </w:r>
+      <w:proofErr w:type="spellEnd"/>
+      <w:r>
+        <w:rPr>
+          <w:rFonts w:ascii="Calibri" w:hAnsi="Calibri"/>
+          <w:color w:val="000000"/>
+        </w:rPr>
+        <w:t>-test. El conteo no implica aceptación funcional. [6, 10]</w:t>
       </w:r>
     </w:p>
     <w:p>
@@ -3193,214 +4254,61 @@
           <w:rFonts w:ascii="Calibri" w:hAnsi="Calibri"/>
           <w:color w:val="000000"/>
         </w:rPr>
-        <w:t>Trazabilidad: cabedeb → services y controllers; cfe98b7 → integración y rutas; f90f82f → SQL y modelo; 0435131 → login visual; 3dcce51 → plan de pruebas. El estado de referencia es f90f82f2a0bbce72ea2c09c35f0bcbf228e41c69. [9]</w:t>
+        <w:t xml:space="preserve">Trazabilidad: </w:t>
       </w:r>
-    </w:p>
-    <w:p>
-      <w:pPr>
-        <w:keepNext/>
-        <w:pageBreakBefore/>
-        <w:spacing w:after="100" w:line="240" w:lineRule="auto"/>
-      </w:pPr>
+      <w:proofErr w:type="spellStart"/>
       <w:r>
         <w:rPr>
           <w:rFonts w:ascii="Calibri" w:hAnsi="Calibri"/>
-          <w:b/>
           <w:color w:val="000000"/>
-          <w:sz w:val="24"/>
-        </w:rPr>
-        <w:lastRenderedPageBreak/>
-        <w:t xml:space="preserve">Anexo </w:t>
+        </w:rPr>
+        <w:t>cabedeb</w:t>
       </w:r>
+      <w:proofErr w:type="spellEnd"/>
       <w:r>
         <w:rPr>
           <w:rFonts w:ascii="Calibri" w:hAnsi="Calibri"/>
-          <w:b/>
           <w:color w:val="000000"/>
-          <w:sz w:val="24"/>
-        </w:rPr>
-        <w:t>C</w:t>
+        </w:rPr>
+        <w:t xml:space="preserve"> → </w:t>
       </w:r>
+      <w:proofErr w:type="spellStart"/>
       <w:r>
         <w:rPr>
           <w:rFonts w:ascii="Calibri" w:hAnsi="Calibri"/>
-          <w:b/>
           <w:color w:val="000000"/>
-          <w:sz w:val="24"/>
-        </w:rPr>
-        <w:t xml:space="preserve"> Referencias</w:t>
+        </w:rPr>
+        <w:t>services</w:t>
+      </w:r>
+      <w:proofErr w:type="spellEnd"/>
+      <w:r>
+        <w:rPr>
+          <w:rFonts w:ascii="Calibri" w:hAnsi="Calibri"/>
+          <w:color w:val="000000"/>
+        </w:rPr>
+        <w:t xml:space="preserve"> y </w:t>
+      </w:r>
+      <w:proofErr w:type="spellStart"/>
+      <w:r>
+        <w:rPr>
+          <w:rFonts w:ascii="Calibri" w:hAnsi="Calibri"/>
+          <w:color w:val="000000"/>
+        </w:rPr>
+        <w:t>controllers</w:t>
+      </w:r>
+      <w:proofErr w:type="spellEnd"/>
+      <w:r>
+        <w:rPr>
+          <w:rFonts w:ascii="Calibri" w:hAnsi="Calibri"/>
+          <w:color w:val="000000"/>
+        </w:rPr>
+        <w:t>; cfe98b7 → integración y rutas; f90f82f → SQL y modelo; 0435131 → login visual; 3dcce51 → plan de pruebas. El estado de referencia es f90f82f2a0bbce72ea2c09c35f0bcbf228e41c69. [9]</w:t>
       </w:r>
     </w:p>
     <w:p>
       <w:pPr>
         <w:spacing w:after="100" w:line="240" w:lineRule="auto"/>
       </w:pPr>
-      <w:r>
-        <w:rPr>
-          <w:rFonts w:ascii="Calibri" w:hAnsi="Calibri"/>
-          <w:color w:val="000000"/>
-        </w:rPr>
-        <w:t>[1] Duoc UC. (s. f.). Evaluación Fase 2: Informe avance Proyecto APT. Asignatura PTY4614 Capstone. Archivo 2.5_APT122_Sumativa Avance Fase2.pdf, pp. 1–8.</w:t>
-      </w:r>
-    </w:p>
-    <w:p>
-      <w:pPr>
-        <w:spacing w:after="100" w:line="240" w:lineRule="auto"/>
-      </w:pPr>
-      <w:r>
-        <w:rPr>
-          <w:rFonts w:ascii="Calibri" w:hAnsi="Calibri"/>
-          <w:color w:val="000000"/>
-        </w:rPr>
-        <w:t>[2] Equipo del proyecto. (2026). Guía de definición del Proyecto APT, análisis del caso y matriz de responsabilidades. Fase 1/Evidencias Grupales. Repositorio capstone.</w:t>
-      </w:r>
-    </w:p>
-    <w:p>
-      <w:pPr>
-        <w:spacing w:after="100" w:line="240" w:lineRule="auto"/>
-      </w:pPr>
-      <w:r>
-        <w:rPr>
-          <w:rFonts w:ascii="Calibri" w:hAnsi="Calibri"/>
-          <w:color w:val="000000"/>
-        </w:rPr>
-        <w:t>[3] Equipo del proyecto. (2026). Product Backlog Priorizado. Fase 1/Evidencias Grupales. 15 historias de usuario y esfuerzo estimado de 136 horas.</w:t>
-      </w:r>
-    </w:p>
-    <w:p>
-      <w:pPr>
-        <w:spacing w:after="100" w:line="240" w:lineRule="auto"/>
-      </w:pPr>
-      <w:r>
-        <w:rPr>
-          <w:rFonts w:ascii="Calibri" w:hAnsi="Calibri"/>
-          <w:color w:val="000000"/>
-        </w:rPr>
-        <w:t>[4] Equipo del proyecto. (2026). User Story Mapping.xlsx. Fase 1/Evidencias Grupales. Alcance MVP e incrementos posteriores.</w:t>
-      </w:r>
-    </w:p>
-    <w:p>
-      <w:pPr>
-        <w:spacing w:after="100" w:line="240" w:lineRule="auto"/>
-      </w:pPr>
-      <w:r>
-        <w:rPr>
-          <w:rFonts w:ascii="Calibri" w:hAnsi="Calibri"/>
-          <w:color w:val="000000"/>
-        </w:rPr>
-        <w:t>[5] Equipo del proyecto. (2026). Sprint Planning Sprint 1. Fase 2/Evidencias Grupales. Plan de pruebas con casos CP-01 a CP-06.</w:t>
-      </w:r>
-    </w:p>
-    <w:p>
-      <w:pPr>
-        <w:spacing w:after="100" w:line="240" w:lineRule="auto"/>
-      </w:pPr>
-      <w:r>
-        <w:rPr>
-          <w:rFonts w:ascii="Calibri" w:hAnsi="Calibri"/>
-          <w:color w:val="000000"/>
-        </w:rPr>
-        <w:t>[6] Equipo del proyecto. (2026). Código de frontend y backend. Fase 2/Codigo. Versión de referencia f90f82f2a0bbce72ea2c09c35f0bcbf228e41c69.</w:t>
-      </w:r>
-    </w:p>
-    <w:p>
-      <w:pPr>
-        <w:spacing w:after="100" w:line="240" w:lineRule="auto"/>
-      </w:pPr>
-      <w:r>
-        <w:rPr>
-          <w:rFonts w:ascii="Calibri" w:hAnsi="Calibri"/>
-          <w:color w:val="000000"/>
-        </w:rPr>
-        <w:t>[7] Equipo del proyecto. (2026). script_base_datos.sql, Diccionario_de_datos_escuela_conductores.xlsx, Modelo Relacional normalizado.mwb y Diagrama_de_clases.png. Fase 2/Evidencias Grupales.</w:t>
-      </w:r>
-    </w:p>
-    <w:p>
-      <w:pPr>
-        <w:spacing w:after="100" w:line="240" w:lineRule="auto"/>
-      </w:pPr>
-      <w:r>
-        <w:rPr>
-          <w:rFonts w:ascii="Calibri" w:hAnsi="Calibri"/>
-          <w:color w:val="000000"/>
-        </w:rPr>
-        <w:t>[8] Equipo del proyecto. (2026). Sprint_Backlog_Semana8.png y Evidencia_Scrumboard_Semana8.png. Capturas de seguimiento de Fase 2.</w:t>
-      </w:r>
-    </w:p>
-    <w:p>
-      <w:pPr>
-        <w:spacing w:after="100" w:line="240" w:lineRule="auto"/>
-      </w:pPr>
-      <w:r>
-        <w:rPr>
-          <w:rFonts w:ascii="Calibri" w:hAnsi="Calibri"/>
-          <w:color w:val="000000"/>
-        </w:rPr>
-        <w:t xml:space="preserve">[9] Equipo del proyecto. (2026). Historial Git de capstone. </w:t>
-      </w:r>
-      <w:r>
-        <w:rPr>
-          <w:rFonts w:ascii="Calibri" w:hAnsi="Calibri"/>
-          <w:color w:val="000000"/>
-          <w:lang w:val="en-US"/>
-        </w:rPr>
-        <w:t xml:space="preserve">Commits 3dcce51, 14d21f3, 7b5c4d0, 0435131, cabedeb, cfe98b7 y f90f82f. </w:t>
-      </w:r>
-      <w:r>
-        <w:rPr>
-          <w:rFonts w:ascii="Calibri" w:hAnsi="Calibri"/>
-          <w:color w:val="000000"/>
-        </w:rPr>
-        <w:t>Consulta y coincidencia de HEAD remoto verificadas el 18 de octubre de 2026.</w:t>
-      </w:r>
-    </w:p>
-    <w:p>
-      <w:pPr>
-        <w:spacing w:after="100" w:line="240" w:lineRule="auto"/>
-      </w:pPr>
-      <w:r>
-        <w:rPr>
-          <w:rFonts w:ascii="Calibri" w:hAnsi="Calibri"/>
-          <w:color w:val="000000"/>
-        </w:rPr>
-        <w:t>[10] Verificación técnica del corte. (18 de octubre de 2026). Compilación con Vite, comprobación de sintaxis, 59 despachos HTTP con dobles y 13 validaciones de entrada. Síntesis de resultados en el apartado Evidencias de avance de esta guía.</w:t>
-      </w:r>
-    </w:p>
-    <w:p>
-      <w:pPr>
-        <w:spacing w:after="100" w:line="240" w:lineRule="auto"/>
-      </w:pPr>
-      <w:r>
-        <w:rPr>
-          <w:rFonts w:ascii="Calibri" w:hAnsi="Calibri"/>
-          <w:color w:val="000000"/>
-        </w:rPr>
-        <w:t>[11] Godoy, G. (18 de octubre de 2026). Comunicación personal sobre la retroalimentación de Fase 1 del docente Diego Alberto Garcés Miranda: ortografía, evidencias, alcance y plan de trabajo. Confirmación de la cuenta smhnaxho como identidad Git de Máximo Ortega.</w:t>
-      </w:r>
-    </w:p>
-    <w:p>
-      <w:pPr>
-        <w:spacing w:after="100" w:line="240" w:lineRule="auto"/>
-      </w:pPr>
-      <w:r>
-        <w:rPr>
-          <w:rFonts w:ascii="Calibri" w:hAnsi="Calibri"/>
-          <w:color w:val="000000"/>
-        </w:rPr>
-        <w:t>Repositorio: https://github.com/Gavoo0/capstone</w:t>
-      </w:r>
-    </w:p>
-    <w:p>
-      <w:pPr>
-        <w:spacing w:after="100" w:line="240" w:lineRule="auto"/>
-      </w:pPr>
-      <w:r>
-        <w:rPr>
-          <w:rFonts w:ascii="Calibri" w:hAnsi="Calibri"/>
-          <w:color w:val="000000"/>
-        </w:rPr>
-        <w:t>Versión consultada: https://github.com/Gavoo0/capstone/tree/f90f82f2a0bbce72ea2c09c35f0bcbf228e41c69</w:t>
-      </w:r>
     </w:p>
     <w:sectPr>
       <w:headerReference w:type="default" r:id="rId13"/>
@@ -3415,7 +4323,7 @@
 </file>
 
 <file path=word/endnotes.xml><?xml version="1.0" encoding="utf-8"?>
-<w:endnotes xmlns:wpc="http://schemas.microsoft.com/office/word/2010/wordprocessingCanvas" xmlns:cx="http://schemas.microsoft.com/office/drawing/2014/chartex" xmlns:cx1="http://schemas.microsoft.com/office/drawing/2015/9/8/chartex" xmlns:cx2="http://schemas.microsoft.com/office/drawing/2015/10/21/chartex" xmlns:cx3="http://schemas.microsoft.com/office/drawing/2016/5/9/chartex" xmlns:cx4="http://schemas.microsoft.com/office/drawing/2016/5/10/chartex" xmlns:cx5="http://schemas.microsoft.com/office/drawing/2016/5/11/chartex" xmlns:cx6="http://schemas.microsoft.com/office/drawing/2016/5/12/chartex" xmlns:cx7="http://schemas.microsoft.com/office/drawing/2016/5/13/chartex" xmlns:cx8="http://schemas.microsoft.com/office/drawing/2016/5/14/chartex" xmlns:mc="http://schemas.openxmlformats.org/markup-compatibility/2006" xmlns:aink="http://schemas.microsoft.com/office/drawing/2016/ink" xmlns:am3d="http://schemas.microsoft.com/office/drawing/2017/model3d" xmlns:o="urn:schemas-microsoft-com:office:office" xmlns:oel="http://schemas.microsoft.com/office/2019/extlst" xmlns:r="http://schemas.openxmlformats.org/officeDocument/2006/relationships" xmlns:m="http://schemas.openxmlformats.org/officeDocument/2006/math" xmlns:v="urn:schemas-microsoft-com:vml" xmlns:wp14="http://schemas.microsoft.com/office/word/2010/wordprocessingDrawing" xmlns:wp="http://schemas.openxmlformats.org/drawingml/2006/wordprocessingDrawing" xmlns:w10="urn:schemas-microsoft-com:office:word" xmlns:w="http://schemas.openxmlformats.org/wordprocessingml/2006/main" xmlns:w14="http://schemas.microsoft.com/office/word/2010/wordml" xmlns:w15="http://schemas.microsoft.com/office/word/2012/wordml" xmlns:w16cex="http://schemas.microsoft.com/office/word/2018/wordml/cex" xmlns:w16cid="http://schemas.microsoft.com/office/word/2016/wordml/cid" xmlns:w16="http://schemas.microsoft.com/office/word/2018/wordml" xmlns:w16sdtdh="http://schemas.microsoft.com/office/word/2020/wordml/sdtdatahash" xmlns:w16se="http://schemas.microsoft.com/office/word/2015/wordml/symex" xmlns:wpg="http://schemas.microsoft.com/office/word/2010/wordprocessingGroup" xmlns:wpi="http://schemas.microsoft.com/office/word/2010/wordprocessingInk" xmlns:wne="http://schemas.microsoft.com/office/word/2006/wordml" xmlns:wps="http://schemas.microsoft.com/office/word/2010/wordprocessingShape" mc:Ignorable="w14 w15 w16se w16cid w16 w16cex w16sdtdh wp14">
+<w:endnotes xmlns:wpc="http://schemas.microsoft.com/office/word/2010/wordprocessingCanvas" xmlns:cx="http://schemas.microsoft.com/office/drawing/2014/chartex" xmlns:cx1="http://schemas.microsoft.com/office/drawing/2015/9/8/chartex" xmlns:cx2="http://schemas.microsoft.com/office/drawing/2015/10/21/chartex" xmlns:cx3="http://schemas.microsoft.com/office/drawing/2016/5/9/chartex" xmlns:cx4="http://schemas.microsoft.com/office/drawing/2016/5/10/chartex" xmlns:cx5="http://schemas.microsoft.com/office/drawing/2016/5/11/chartex" xmlns:cx6="http://schemas.microsoft.com/office/drawing/2016/5/12/chartex" xmlns:cx7="http://schemas.microsoft.com/office/drawing/2016/5/13/chartex" xmlns:cx8="http://schemas.microsoft.com/office/drawing/2016/5/14/chartex" xmlns:mc="http://schemas.openxmlformats.org/markup-compatibility/2006" xmlns:aink="http://schemas.microsoft.com/office/drawing/2016/ink" xmlns:am3d="http://schemas.microsoft.com/office/drawing/2017/model3d" xmlns:o="urn:schemas-microsoft-com:office:office" xmlns:oel="http://schemas.microsoft.com/office/2019/extlst" xmlns:r="http://schemas.openxmlformats.org/officeDocument/2006/relationships" xmlns:m="http://schemas.openxmlformats.org/officeDocument/2006/math" xmlns:v="urn:schemas-microsoft-com:vml" xmlns:wp14="http://schemas.microsoft.com/office/word/2010/wordprocessingDrawing" xmlns:wp="http://schemas.openxmlformats.org/drawingml/2006/wordprocessingDrawing" xmlns:w10="urn:schemas-microsoft-com:office:word" xmlns:w="http://schemas.openxmlformats.org/wordprocessingml/2006/main" xmlns:w14="http://schemas.microsoft.com/office/word/2010/wordml" xmlns:w15="http://schemas.microsoft.com/office/word/2012/wordml" xmlns:w16cex="http://schemas.microsoft.com/office/word/2018/wordml/cex" xmlns:w16cid="http://schemas.microsoft.com/office/word/2016/wordml/cid" xmlns:w16="http://schemas.microsoft.com/office/word/2018/wordml" xmlns:w16du="http://schemas.microsoft.com/office/word/2023/wordml/word16du" xmlns:w16sdtdh="http://schemas.microsoft.com/office/word/2020/wordml/sdtdatahash" xmlns:w16sdtfl="http://schemas.microsoft.com/office/word/2024/wordml/sdtformatlock" xmlns:w16se="http://schemas.microsoft.com/office/word/2015/wordml/symex" xmlns:wpg="http://schemas.microsoft.com/office/word/2010/wordprocessingGroup" xmlns:wpi="http://schemas.microsoft.com/office/word/2010/wordprocessingInk" xmlns:wne="http://schemas.microsoft.com/office/word/2006/wordml" xmlns:wps="http://schemas.microsoft.com/office/word/2010/wordprocessingShape" mc:Ignorable="w14 w15 w16se w16cid w16 w16cex w16sdtdh w16sdtfl w16du wp14">
   <w:endnote w:type="separator" w:id="-1">
     <w:p>
       <w:pPr>
@@ -3440,7 +4348,7 @@
 </file>
 
 <file path=word/footer1.xml><?xml version="1.0" encoding="utf-8"?>
-<w:ftr xmlns:wpc="http://schemas.microsoft.com/office/word/2010/wordprocessingCanvas" xmlns:cx="http://schemas.microsoft.com/office/drawing/2014/chartex" xmlns:cx1="http://schemas.microsoft.com/office/drawing/2015/9/8/chartex" xmlns:cx2="http://schemas.microsoft.com/office/drawing/2015/10/21/chartex" xmlns:cx3="http://schemas.microsoft.com/office/drawing/2016/5/9/chartex" xmlns:cx4="http://schemas.microsoft.com/office/drawing/2016/5/10/chartex" xmlns:cx5="http://schemas.microsoft.com/office/drawing/2016/5/11/chartex" xmlns:cx6="http://schemas.microsoft.com/office/drawing/2016/5/12/chartex" xmlns:cx7="http://schemas.microsoft.com/office/drawing/2016/5/13/chartex" xmlns:cx8="http://schemas.microsoft.com/office/drawing/2016/5/14/chartex" xmlns:mc="http://schemas.openxmlformats.org/markup-compatibility/2006" xmlns:aink="http://schemas.microsoft.com/office/drawing/2016/ink" xmlns:am3d="http://schemas.microsoft.com/office/drawing/2017/model3d" xmlns:o="urn:schemas-microsoft-com:office:office" xmlns:oel="http://schemas.microsoft.com/office/2019/extlst" xmlns:r="http://schemas.openxmlformats.org/officeDocument/2006/relationships" xmlns:m="http://schemas.openxmlformats.org/officeDocument/2006/math" xmlns:v="urn:schemas-microsoft-com:vml" xmlns:wp14="http://schemas.microsoft.com/office/word/2010/wordprocessingDrawing" xmlns:wp="http://schemas.openxmlformats.org/drawingml/2006/wordprocessingDrawing" xmlns:w10="urn:schemas-microsoft-com:office:word" xmlns:w="http://schemas.openxmlformats.org/wordprocessingml/2006/main" xmlns:w14="http://schemas.microsoft.com/office/word/2010/wordml" xmlns:w15="http://schemas.microsoft.com/office/word/2012/wordml" xmlns:w16cex="http://schemas.microsoft.com/office/word/2018/wordml/cex" xmlns:w16cid="http://schemas.microsoft.com/office/word/2016/wordml/cid" xmlns:w16="http://schemas.microsoft.com/office/word/2018/wordml" xmlns:w16sdtdh="http://schemas.microsoft.com/office/word/2020/wordml/sdtdatahash" xmlns:w16se="http://schemas.microsoft.com/office/word/2015/wordml/symex" xmlns:wpg="http://schemas.microsoft.com/office/word/2010/wordprocessingGroup" xmlns:wpi="http://schemas.microsoft.com/office/word/2010/wordprocessingInk" xmlns:wne="http://schemas.microsoft.com/office/word/2006/wordml" xmlns:wps="http://schemas.microsoft.com/office/word/2010/wordprocessingShape" mc:Ignorable="w14 w15 w16se w16cid w16 w16cex w16sdtdh wp14">
+<w:ftr xmlns:wpc="http://schemas.microsoft.com/office/word/2010/wordprocessingCanvas" xmlns:cx="http://schemas.microsoft.com/office/drawing/2014/chartex" xmlns:cx1="http://schemas.microsoft.com/office/drawing/2015/9/8/chartex" xmlns:cx2="http://schemas.microsoft.com/office/drawing/2015/10/21/chartex" xmlns:cx3="http://schemas.microsoft.com/office/drawing/2016/5/9/chartex" xmlns:cx4="http://schemas.microsoft.com/office/drawing/2016/5/10/chartex" xmlns:cx5="http://schemas.microsoft.com/office/drawing/2016/5/11/chartex" xmlns:cx6="http://schemas.microsoft.com/office/drawing/2016/5/12/chartex" xmlns:cx7="http://schemas.microsoft.com/office/drawing/2016/5/13/chartex" xmlns:cx8="http://schemas.microsoft.com/office/drawing/2016/5/14/chartex" xmlns:mc="http://schemas.openxmlformats.org/markup-compatibility/2006" xmlns:aink="http://schemas.microsoft.com/office/drawing/2016/ink" xmlns:am3d="http://schemas.microsoft.com/office/drawing/2017/model3d" xmlns:o="urn:schemas-microsoft-com:office:office" xmlns:oel="http://schemas.microsoft.com/office/2019/extlst" xmlns:r="http://schemas.openxmlformats.org/officeDocument/2006/relationships" xmlns:m="http://schemas.openxmlformats.org/officeDocument/2006/math" xmlns:v="urn:schemas-microsoft-com:vml" xmlns:wp14="http://schemas.microsoft.com/office/word/2010/wordprocessingDrawing" xmlns:wp="http://schemas.openxmlformats.org/drawingml/2006/wordprocessingDrawing" xmlns:w10="urn:schemas-microsoft-com:office:word" xmlns:w="http://schemas.openxmlformats.org/wordprocessingml/2006/main" xmlns:w14="http://schemas.microsoft.com/office/word/2010/wordml" xmlns:w15="http://schemas.microsoft.com/office/word/2012/wordml" xmlns:w16cex="http://schemas.microsoft.com/office/word/2018/wordml/cex" xmlns:w16cid="http://schemas.microsoft.com/office/word/2016/wordml/cid" xmlns:w16="http://schemas.microsoft.com/office/word/2018/wordml" xmlns:w16du="http://schemas.microsoft.com/office/word/2023/wordml/word16du" xmlns:w16sdtdh="http://schemas.microsoft.com/office/word/2020/wordml/sdtdatahash" xmlns:w16sdtfl="http://schemas.microsoft.com/office/word/2024/wordml/sdtformatlock" xmlns:w16se="http://schemas.microsoft.com/office/word/2015/wordml/symex" xmlns:wpg="http://schemas.microsoft.com/office/word/2010/wordprocessingGroup" xmlns:wpi="http://schemas.microsoft.com/office/word/2010/wordprocessingInk" xmlns:wne="http://schemas.microsoft.com/office/word/2006/wordml" xmlns:wps="http://schemas.microsoft.com/office/word/2010/wordprocessingShape" mc:Ignorable="w14 w15 w16se w16cid w16 w16cex w16sdtdh w16sdtfl w16du wp14">
   <w:p>
     <w:pPr>
       <w:spacing w:after="100" w:line="240" w:lineRule="auto"/>
@@ -3469,7 +4377,7 @@
 </file>
 
 <file path=word/footnotes.xml><?xml version="1.0" encoding="utf-8"?>
-<w:footnotes xmlns:wpc="http://schemas.microsoft.com/office/word/2010/wordprocessingCanvas" xmlns:cx="http://schemas.microsoft.com/office/drawing/2014/chartex" xmlns:cx1="http://schemas.microsoft.com/office/drawing/2015/9/8/chartex" xmlns:cx2="http://schemas.microsoft.com/office/drawing/2015/10/21/chartex" xmlns:cx3="http://schemas.microsoft.com/office/drawing/2016/5/9/chartex" xmlns:cx4="http://schemas.microsoft.com/office/drawing/2016/5/10/chartex" xmlns:cx5="http://schemas.microsoft.com/office/drawing/2016/5/11/chartex" xmlns:cx6="http://schemas.microsoft.com/office/drawing/2016/5/12/chartex" xmlns:cx7="http://schemas.microsoft.com/office/drawing/2016/5/13/chartex" xmlns:cx8="http://schemas.microsoft.com/office/drawing/2016/5/14/chartex" xmlns:mc="http://schemas.openxmlformats.org/markup-compatibility/2006" xmlns:aink="http://schemas.microsoft.com/office/drawing/2016/ink" xmlns:am3d="http://schemas.microsoft.com/office/drawing/2017/model3d" xmlns:o="urn:schemas-microsoft-com:office:office" xmlns:oel="http://schemas.microsoft.com/office/2019/extlst" xmlns:r="http://schemas.openxmlformats.org/officeDocument/2006/relationships" xmlns:m="http://schemas.openxmlformats.org/officeDocument/2006/math" xmlns:v="urn:schemas-microsoft-com:vml" xmlns:wp14="http://schemas.microsoft.com/office/word/2010/wordprocessingDrawing" xmlns:wp="http://schemas.openxmlformats.org/drawingml/2006/wordprocessingDrawing" xmlns:w10="urn:schemas-microsoft-com:office:word" xmlns:w="http://schemas.openxmlformats.org/wordprocessingml/2006/main" xmlns:w14="http://schemas.microsoft.com/office/word/2010/wordml" xmlns:w15="http://schemas.microsoft.com/office/word/2012/wordml" xmlns:w16cex="http://schemas.microsoft.com/office/word/2018/wordml/cex" xmlns:w16cid="http://schemas.microsoft.com/office/word/2016/wordml/cid" xmlns:w16="http://schemas.microsoft.com/office/word/2018/wordml" xmlns:w16sdtdh="http://schemas.microsoft.com/office/word/2020/wordml/sdtdatahash" xmlns:w16se="http://schemas.microsoft.com/office/word/2015/wordml/symex" xmlns:wpg="http://schemas.microsoft.com/office/word/2010/wordprocessingGroup" xmlns:wpi="http://schemas.microsoft.com/office/word/2010/wordprocessingInk" xmlns:wne="http://schemas.microsoft.com/office/word/2006/wordml" xmlns:wps="http://schemas.microsoft.com/office/word/2010/wordprocessingShape" mc:Ignorable="w14 w15 w16se w16cid w16 w16cex w16sdtdh wp14">
+<w:footnotes xmlns:wpc="http://schemas.microsoft.com/office/word/2010/wordprocessingCanvas" xmlns:cx="http://schemas.microsoft.com/office/drawing/2014/chartex" xmlns:cx1="http://schemas.microsoft.com/office/drawing/2015/9/8/chartex" xmlns:cx2="http://schemas.microsoft.com/office/drawing/2015/10/21/chartex" xmlns:cx3="http://schemas.microsoft.com/office/drawing/2016/5/9/chartex" xmlns:cx4="http://schemas.microsoft.com/office/drawing/2016/5/10/chartex" xmlns:cx5="http://schemas.microsoft.com/office/drawing/2016/5/11/chartex" xmlns:cx6="http://schemas.microsoft.com/office/drawing/2016/5/12/chartex" xmlns:cx7="http://schemas.microsoft.com/office/drawing/2016/5/13/chartex" xmlns:cx8="http://schemas.microsoft.com/office/drawing/2016/5/14/chartex" xmlns:mc="http://schemas.openxmlformats.org/markup-compatibility/2006" xmlns:aink="http://schemas.microsoft.com/office/drawing/2016/ink" xmlns:am3d="http://schemas.microsoft.com/office/drawing/2017/model3d" xmlns:o="urn:schemas-microsoft-com:office:office" xmlns:oel="http://schemas.microsoft.com/office/2019/extlst" xmlns:r="http://schemas.openxmlformats.org/officeDocument/2006/relationships" xmlns:m="http://schemas.openxmlformats.org/officeDocument/2006/math" xmlns:v="urn:schemas-microsoft-com:vml" xmlns:wp14="http://schemas.microsoft.com/office/word/2010/wordprocessingDrawing" xmlns:wp="http://schemas.openxmlformats.org/drawingml/2006/wordprocessingDrawing" xmlns:w10="urn:schemas-microsoft-com:office:word" xmlns:w="http://schemas.openxmlformats.org/wordprocessingml/2006/main" xmlns:w14="http://schemas.microsoft.com/office/word/2010/wordml" xmlns:w15="http://schemas.microsoft.com/office/word/2012/wordml" xmlns:w16cex="http://schemas.microsoft.com/office/word/2018/wordml/cex" xmlns:w16cid="http://schemas.microsoft.com/office/word/2016/wordml/cid" xmlns:w16="http://schemas.microsoft.com/office/word/2018/wordml" xmlns:w16du="http://schemas.microsoft.com/office/word/2023/wordml/word16du" xmlns:w16sdtdh="http://schemas.microsoft.com/office/word/2020/wordml/sdtdatahash" xmlns:w16sdtfl="http://schemas.microsoft.com/office/word/2024/wordml/sdtformatlock" xmlns:w16se="http://schemas.microsoft.com/office/word/2015/wordml/symex" xmlns:wpg="http://schemas.microsoft.com/office/word/2010/wordprocessingGroup" xmlns:wpi="http://schemas.microsoft.com/office/word/2010/wordprocessingInk" xmlns:wne="http://schemas.microsoft.com/office/word/2006/wordml" xmlns:wps="http://schemas.microsoft.com/office/word/2010/wordprocessingShape" mc:Ignorable="w14 w15 w16se w16cid w16 w16cex w16sdtdh w16sdtfl w16du wp14">
   <w:footnote w:type="separator" w:id="-1">
     <w:p>
       <w:pPr>
@@ -3552,7 +4460,7 @@
 </file>
 
 <file path=word/header1.xml><?xml version="1.0" encoding="utf-8"?>
-<w:hdr xmlns:wpc="http://schemas.microsoft.com/office/word/2010/wordprocessingCanvas" xmlns:cx="http://schemas.microsoft.com/office/drawing/2014/chartex" xmlns:cx1="http://schemas.microsoft.com/office/drawing/2015/9/8/chartex" xmlns:cx2="http://schemas.microsoft.com/office/drawing/2015/10/21/chartex" xmlns:cx3="http://schemas.microsoft.com/office/drawing/2016/5/9/chartex" xmlns:cx4="http://schemas.microsoft.com/office/drawing/2016/5/10/chartex" xmlns:cx5="http://schemas.microsoft.com/office/drawing/2016/5/11/chartex" xmlns:cx6="http://schemas.microsoft.com/office/drawing/2016/5/12/chartex" xmlns:cx7="http://schemas.microsoft.com/office/drawing/2016/5/13/chartex" xmlns:cx8="http://schemas.microsoft.com/office/drawing/2016/5/14/chartex" xmlns:mc="http://schemas.openxmlformats.org/markup-compatibility/2006" xmlns:aink="http://schemas.microsoft.com/office/drawing/2016/ink" xmlns:am3d="http://schemas.microsoft.com/office/drawing/2017/model3d" xmlns:o="urn:schemas-microsoft-com:office:office" xmlns:oel="http://schemas.microsoft.com/office/2019/extlst" xmlns:r="http://schemas.openxmlformats.org/officeDocument/2006/relationships" xmlns:m="http://schemas.openxmlformats.org/officeDocument/2006/math" xmlns:v="urn:schemas-microsoft-com:vml" xmlns:wp14="http://schemas.microsoft.com/office/word/2010/wordprocessingDrawing" xmlns:wp="http://schemas.openxmlformats.org/drawingml/2006/wordprocessingDrawing" xmlns:w10="urn:schemas-microsoft-com:office:word" xmlns:w="http://schemas.openxmlformats.org/wordprocessingml/2006/main" xmlns:w14="http://schemas.microsoft.com/office/word/2010/wordml" xmlns:w15="http://schemas.microsoft.com/office/word/2012/wordml" xmlns:w16cex="http://schemas.microsoft.com/office/word/2018/wordml/cex" xmlns:w16cid="http://schemas.microsoft.com/office/word/2016/wordml/cid" xmlns:w16="http://schemas.microsoft.com/office/word/2018/wordml" xmlns:w16sdtdh="http://schemas.microsoft.com/office/word/2020/wordml/sdtdatahash" xmlns:w16se="http://schemas.microsoft.com/office/word/2015/wordml/symex" xmlns:wpg="http://schemas.microsoft.com/office/word/2010/wordprocessingGroup" xmlns:wpi="http://schemas.microsoft.com/office/word/2010/wordprocessingInk" xmlns:wne="http://schemas.microsoft.com/office/word/2006/wordml" xmlns:wps="http://schemas.microsoft.com/office/word/2010/wordprocessingShape" mc:Ignorable="w14 w15 w16se w16cid w16 w16cex w16sdtdh wp14">
+<w:hdr xmlns:wpc="http://schemas.microsoft.com/office/word/2010/wordprocessingCanvas" xmlns:cx="http://schemas.microsoft.com/office/drawing/2014/chartex" xmlns:cx1="http://schemas.microsoft.com/office/drawing/2015/9/8/chartex" xmlns:cx2="http://schemas.microsoft.com/office/drawing/2015/10/21/chartex" xmlns:cx3="http://schemas.microsoft.com/office/drawing/2016/5/9/chartex" xmlns:cx4="http://schemas.microsoft.com/office/drawing/2016/5/10/chartex" xmlns:cx5="http://schemas.microsoft.com/office/drawing/2016/5/11/chartex" xmlns:cx6="http://schemas.microsoft.com/office/drawing/2016/5/12/chartex" xmlns:cx7="http://schemas.microsoft.com/office/drawing/2016/5/13/chartex" xmlns:cx8="http://schemas.microsoft.com/office/drawing/2016/5/14/chartex" xmlns:mc="http://schemas.openxmlformats.org/markup-compatibility/2006" xmlns:aink="http://schemas.microsoft.com/office/drawing/2016/ink" xmlns:am3d="http://schemas.microsoft.com/office/drawing/2017/model3d" xmlns:o="urn:schemas-microsoft-com:office:office" xmlns:oel="http://schemas.microsoft.com/office/2019/extlst" xmlns:r="http://schemas.openxmlformats.org/officeDocument/2006/relationships" xmlns:m="http://schemas.openxmlformats.org/officeDocument/2006/math" xmlns:v="urn:schemas-microsoft-com:vml" xmlns:wp14="http://schemas.microsoft.com/office/word/2010/wordprocessingDrawing" xmlns:wp="http://schemas.openxmlformats.org/drawingml/2006/wordprocessingDrawing" xmlns:w10="urn:schemas-microsoft-com:office:word" xmlns:w="http://schemas.openxmlformats.org/wordprocessingml/2006/main" xmlns:w14="http://schemas.microsoft.com/office/word/2010/wordml" xmlns:w15="http://schemas.microsoft.com/office/word/2012/wordml" xmlns:w16cex="http://schemas.microsoft.com/office/word/2018/wordml/cex" xmlns:w16cid="http://schemas.microsoft.com/office/word/2016/wordml/cid" xmlns:w16="http://schemas.microsoft.com/office/word/2018/wordml" xmlns:w16du="http://schemas.microsoft.com/office/word/2023/wordml/word16du" xmlns:w16sdtdh="http://schemas.microsoft.com/office/word/2020/wordml/sdtdatahash" xmlns:w16sdtfl="http://schemas.microsoft.com/office/word/2024/wordml/sdtformatlock" xmlns:w16se="http://schemas.microsoft.com/office/word/2015/wordml/symex" xmlns:wpg="http://schemas.microsoft.com/office/word/2010/wordprocessingGroup" xmlns:wpi="http://schemas.microsoft.com/office/word/2010/wordprocessingInk" xmlns:wne="http://schemas.microsoft.com/office/word/2006/wordml" xmlns:wps="http://schemas.microsoft.com/office/word/2010/wordprocessingShape" mc:Ignorable="w14 w15 w16se w16cid w16 w16cex w16sdtdh w16sdtfl w16du wp14">
   <w:tbl>
     <w:tblPr>
       <w:tblStyle w:val="Tablaconcuadrcula1"/>
@@ -3777,7 +4685,7 @@
 </file>
 
 <file path=word/numbering.xml><?xml version="1.0" encoding="utf-8"?>
-<w:numbering xmlns:wpc="http://schemas.microsoft.com/office/word/2010/wordprocessingCanvas" xmlns:cx="http://schemas.microsoft.com/office/drawing/2014/chartex" xmlns:cx1="http://schemas.microsoft.com/office/drawing/2015/9/8/chartex" xmlns:cx2="http://schemas.microsoft.com/office/drawing/2015/10/21/chartex" xmlns:cx3="http://schemas.microsoft.com/office/drawing/2016/5/9/chartex" xmlns:cx4="http://schemas.microsoft.com/office/drawing/2016/5/10/chartex" xmlns:cx5="http://schemas.microsoft.com/office/drawing/2016/5/11/chartex" xmlns:cx6="http://schemas.microsoft.com/office/drawing/2016/5/12/chartex" xmlns:cx7="http://schemas.microsoft.com/office/drawing/2016/5/13/chartex" xmlns:cx8="http://schemas.microsoft.com/office/drawing/2016/5/14/chartex" xmlns:mc="http://schemas.openxmlformats.org/markup-compatibility/2006" xmlns:aink="http://schemas.microsoft.com/office/drawing/2016/ink" xmlns:am3d="http://schemas.microsoft.com/office/drawing/2017/model3d" xmlns:o="urn:schemas-microsoft-com:office:office" xmlns:oel="http://schemas.microsoft.com/office/2019/extlst" xmlns:r="http://schemas.openxmlformats.org/officeDocument/2006/relationships" xmlns:m="http://schemas.openxmlformats.org/officeDocument/2006/math" xmlns:v="urn:schemas-microsoft-com:vml" xmlns:wp14="http://schemas.microsoft.com/office/word/2010/wordprocessingDrawing" xmlns:wp="http://schemas.openxmlformats.org/drawingml/2006/wordprocessingDrawing" xmlns:w10="urn:schemas-microsoft-com:office:word" xmlns:w="http://schemas.openxmlformats.org/wordprocessingml/2006/main" xmlns:w14="http://schemas.microsoft.com/office/word/2010/wordml" xmlns:w15="http://schemas.microsoft.com/office/word/2012/wordml" xmlns:w16cex="http://schemas.microsoft.com/office/word/2018/wordml/cex" xmlns:w16cid="http://schemas.microsoft.com/office/word/2016/wordml/cid" xmlns:w16="http://schemas.microsoft.com/office/word/2018/wordml" xmlns:w16sdtdh="http://schemas.microsoft.com/office/word/2020/wordml/sdtdatahash" xmlns:w16se="http://schemas.microsoft.com/office/word/2015/wordml/symex" xmlns:wpg="http://schemas.microsoft.com/office/word/2010/wordprocessingGroup" xmlns:wpi="http://schemas.microsoft.com/office/word/2010/wordprocessingInk" xmlns:wne="http://schemas.microsoft.com/office/word/2006/wordml" xmlns:wps="http://schemas.microsoft.com/office/word/2010/wordprocessingShape" mc:Ignorable="w14 w15 w16se w16cid w16 w16cex w16sdtdh wp14">
+<w:numbering xmlns:wpc="http://schemas.microsoft.com/office/word/2010/wordprocessingCanvas" xmlns:cx="http://schemas.microsoft.com/office/drawing/2014/chartex" xmlns:cx1="http://schemas.microsoft.com/office/drawing/2015/9/8/chartex" xmlns:cx2="http://schemas.microsoft.com/office/drawing/2015/10/21/chartex" xmlns:cx3="http://schemas.microsoft.com/office/drawing/2016/5/9/chartex" xmlns:cx4="http://schemas.microsoft.com/office/drawing/2016/5/10/chartex" xmlns:cx5="http://schemas.microsoft.com/office/drawing/2016/5/11/chartex" xmlns:cx6="http://schemas.microsoft.com/office/drawing/2016/5/12/chartex" xmlns:cx7="http://schemas.microsoft.com/office/drawing/2016/5/13/chartex" xmlns:cx8="http://schemas.microsoft.com/office/drawing/2016/5/14/chartex" xmlns:mc="http://schemas.openxmlformats.org/markup-compatibility/2006" xmlns:aink="http://schemas.microsoft.com/office/drawing/2016/ink" xmlns:am3d="http://schemas.microsoft.com/office/drawing/2017/model3d" xmlns:o="urn:schemas-microsoft-com:office:office" xmlns:oel="http://schemas.microsoft.com/office/2019/extlst" xmlns:r="http://schemas.openxmlformats.org/officeDocument/2006/relationships" xmlns:m="http://schemas.openxmlformats.org/officeDocument/2006/math" xmlns:v="urn:schemas-microsoft-com:vml" xmlns:wp14="http://schemas.microsoft.com/office/word/2010/wordprocessingDrawing" xmlns:wp="http://schemas.openxmlformats.org/drawingml/2006/wordprocessingDrawing" xmlns:w10="urn:schemas-microsoft-com:office:word" xmlns:w="http://schemas.openxmlformats.org/wordprocessingml/2006/main" xmlns:w14="http://schemas.microsoft.com/office/word/2010/wordml" xmlns:w15="http://schemas.microsoft.com/office/word/2012/wordml" xmlns:w16cex="http://schemas.microsoft.com/office/word/2018/wordml/cex" xmlns:w16cid="http://schemas.microsoft.com/office/word/2016/wordml/cid" xmlns:w16="http://schemas.microsoft.com/office/word/2018/wordml" xmlns:w16du="http://schemas.microsoft.com/office/word/2023/wordml/word16du" xmlns:w16sdtdh="http://schemas.microsoft.com/office/word/2020/wordml/sdtdatahash" xmlns:w16sdtfl="http://schemas.microsoft.com/office/word/2024/wordml/sdtformatlock" xmlns:w16se="http://schemas.microsoft.com/office/word/2015/wordml/symex" xmlns:wpg="http://schemas.microsoft.com/office/word/2010/wordprocessingGroup" xmlns:wpi="http://schemas.microsoft.com/office/word/2010/wordprocessingInk" xmlns:wne="http://schemas.microsoft.com/office/word/2006/wordml" xmlns:wps="http://schemas.microsoft.com/office/word/2010/wordprocessingShape" mc:Ignorable="w14 w15 w16se w16cid w16 w16cex w16sdtdh w16sdtfl w16du wp14">
   <w:abstractNum w:abstractNumId="0" w15:restartNumberingAfterBreak="0">
     <w:nsid w:val="2FFD4C7F"/>
     <w:multiLevelType w:val="multilevel"/>
@@ -3906,7 +4814,7 @@
 </file>
 
 <file path=word/styles.xml><?xml version="1.0" encoding="utf-8"?>
-<w:styles xmlns:mc="http://schemas.openxmlformats.org/markup-compatibility/2006" xmlns:r="http://schemas.openxmlformats.org/officeDocument/2006/relationships" xmlns:w="http://schemas.openxmlformats.org/wordprocessingml/2006/main" xmlns:w14="http://schemas.microsoft.com/office/word/2010/wordml" xmlns:w15="http://schemas.microsoft.com/office/word/2012/wordml" xmlns:w16cex="http://schemas.microsoft.com/office/word/2018/wordml/cex" xmlns:w16cid="http://schemas.microsoft.com/office/word/2016/wordml/cid" xmlns:w16="http://schemas.microsoft.com/office/word/2018/wordml" xmlns:w16sdtdh="http://schemas.microsoft.com/office/word/2020/wordml/sdtdatahash" xmlns:w16se="http://schemas.microsoft.com/office/word/2015/wordml/symex" mc:Ignorable="w14 w15 w16se w16cid w16 w16cex w16sdtdh">
+<w:styles xmlns:mc="http://schemas.openxmlformats.org/markup-compatibility/2006" xmlns:r="http://schemas.openxmlformats.org/officeDocument/2006/relationships" xmlns:w="http://schemas.openxmlformats.org/wordprocessingml/2006/main" xmlns:w14="http://schemas.microsoft.com/office/word/2010/wordml" xmlns:w15="http://schemas.microsoft.com/office/word/2012/wordml" xmlns:w16cex="http://schemas.microsoft.com/office/word/2018/wordml/cex" xmlns:w16cid="http://schemas.microsoft.com/office/word/2016/wordml/cid" xmlns:w16="http://schemas.microsoft.com/office/word/2018/wordml" xmlns:w16du="http://schemas.microsoft.com/office/word/2023/wordml/word16du" xmlns:w16sdtdh="http://schemas.microsoft.com/office/word/2020/wordml/sdtdatahash" xmlns:w16sdtfl="http://schemas.microsoft.com/office/word/2024/wordml/sdtformatlock" xmlns:w16se="http://schemas.microsoft.com/office/word/2015/wordml/symex" mc:Ignorable="w14 w15 w16se w16cid w16 w16cex w16sdtdh w16sdtfl w16du">
   <w:docDefaults>
     <w:rPrDefault>
       <w:rPr>
@@ -4897,6 +5805,21 @@
 </file>
 
 <file path=customXml/item1.xml><?xml version="1.0" encoding="utf-8"?>
+<?mso-contentType ?>
+<FormTemplates xmlns="http://schemas.microsoft.com/sharepoint/v3/contenttype/forms">
+  <Display>DocumentLibraryForm</Display>
+  <Edit>DocumentLibraryForm</Edit>
+  <New>DocumentLibraryForm</New>
+</FormTemplates>
+</file>
+
+<file path=customXml/item2.xml><?xml version="1.0" encoding="utf-8"?>
+<p:properties xmlns:p="http://schemas.microsoft.com/office/2006/metadata/properties" xmlns:xsi="http://www.w3.org/2001/XMLSchema-instance" xmlns:pc="http://schemas.microsoft.com/office/infopath/2007/PartnerControls">
+  <documentManagement/>
+</p:properties>
+</file>
+
+<file path=customXml/item3.xml><?xml version="1.0" encoding="utf-8"?>
 <ct:contentTypeSchema xmlns:ct="http://schemas.microsoft.com/office/2006/metadata/contentType" xmlns:ma="http://schemas.microsoft.com/office/2006/metadata/properties/metaAttributes" ct:_="" ma:_="" ma:contentTypeName="Documento" ma:contentTypeID="0x010100E96778489EE7714D8BD12CC105EB918B" ma:contentTypeVersion="2" ma:contentTypeDescription="Crear nuevo documento." ma:contentTypeScope="" ma:versionID="416c5c7ae9b5d54d83875cd3c65194e3">
   <xsd:schema xmlns:xsd="http://www.w3.org/2001/XMLSchema" xmlns:xs="http://www.w3.org/2001/XMLSchema" xmlns:p="http://schemas.microsoft.com/office/2006/metadata/properties" xmlns:ns2="126e8a1c-9ea9-435a-ac89-d06c80d62e30" targetNamespace="http://schemas.microsoft.com/office/2006/metadata/properties" ma:root="true" ma:fieldsID="70a237c842677bd850644f8595079f5e" ns2:_="">
     <xsd:import namespace="126e8a1c-9ea9-435a-ac89-d06c80d62e30"/>
@@ -5028,22 +5951,24 @@
 </ct:contentTypeSchema>
 </file>
 
-<file path=customXml/item2.xml><?xml version="1.0" encoding="utf-8"?>
-<p:properties xmlns:p="http://schemas.microsoft.com/office/2006/metadata/properties" xmlns:xsi="http://www.w3.org/2001/XMLSchema-instance" xmlns:pc="http://schemas.microsoft.com/office/infopath/2007/PartnerControls">
-  <documentManagement/>
-</p:properties>
+<file path=customXml/itemProps1.xml><?xml version="1.0" encoding="utf-8"?>
+<ds:datastoreItem xmlns:ds="http://schemas.openxmlformats.org/officeDocument/2006/customXml" ds:itemID="{D51C61E4-DB75-4684-AD25-71F546404E96}">
+  <ds:schemaRefs>
+    <ds:schemaRef ds:uri="http://schemas.microsoft.com/sharepoint/v3/contenttype/forms"/>
+  </ds:schemaRefs>
+</ds:datastoreItem>
 </file>
 
-<file path=customXml/item3.xml><?xml version="1.0" encoding="utf-8"?>
-<?mso-contentType ?>
-<FormTemplates xmlns="http://schemas.microsoft.com/sharepoint/v3/contenttype/forms">
-  <Display>DocumentLibraryForm</Display>
-  <Edit>DocumentLibraryForm</Edit>
-  <New>DocumentLibraryForm</New>
-</FormTemplates>
+<file path=customXml/itemProps2.xml><?xml version="1.0" encoding="utf-8"?>
+<ds:datastoreItem xmlns:ds="http://schemas.openxmlformats.org/officeDocument/2006/customXml" ds:itemID="{46CA5683-AF87-4E40-B841-2E23A3B52406}">
+  <ds:schemaRefs>
+    <ds:schemaRef ds:uri="http://schemas.microsoft.com/office/2006/metadata/properties"/>
+    <ds:schemaRef ds:uri="http://schemas.microsoft.com/office/infopath/2007/PartnerControls"/>
+  </ds:schemaRefs>
+</ds:datastoreItem>
 </file>
 
-<file path=customXml/itemProps1.xml><?xml version="1.0" encoding="utf-8"?>
+<file path=customXml/itemProps3.xml><?xml version="1.0" encoding="utf-8"?>
 <ds:datastoreItem xmlns:ds="http://schemas.openxmlformats.org/officeDocument/2006/customXml" ds:itemID="{6F3661B0-5934-4FAB-ADC6-33A19B814E8D}">
   <ds:schemaRefs>
     <ds:schemaRef ds:uri="http://schemas.microsoft.com/office/2006/metadata/contentType"/>
@@ -5059,21 +5984,4 @@
     <ds:schemaRef ds:uri="http://schemas.microsoft.com/internal/obd"/>
   </ds:schemaRefs>
 </ds:datastoreItem>
-</file>
-
-<file path=customXml/itemProps2.xml><?xml version="1.0" encoding="utf-8"?>
-<ds:datastoreItem xmlns:ds="http://schemas.openxmlformats.org/officeDocument/2006/customXml" ds:itemID="{46CA5683-AF87-4E40-B841-2E23A3B52406}">
-  <ds:schemaRefs>
-    <ds:schemaRef ds:uri="http://schemas.microsoft.com/office/2006/metadata/properties"/>
-    <ds:schemaRef ds:uri="http://schemas.microsoft.com/office/infopath/2007/PartnerControls"/>
-  </ds:schemaRefs>
-</ds:datastoreItem>
-</file>
-
-<file path=customXml/itemProps3.xml><?xml version="1.0" encoding="utf-8"?>
-<ds:datastoreItem xmlns:ds="http://schemas.openxmlformats.org/officeDocument/2006/customXml" ds:itemID="{D51C61E4-DB75-4684-AD25-71F546404E96}">
-  <ds:schemaRefs>
-    <ds:schemaRef ds:uri="http://schemas.microsoft.com/sharepoint/v3/contenttype/forms"/>
-  </ds:schemaRefs>
-</ds:datastoreItem>
 </file>
</xml_diff>